<commit_message>
style(papers-en): format statistical variables as LaTeX + remove stray symbols (Scopus/WoS)
Convert bare Unicode notation in the 6 English manuscripts to LaTeX inline math
per the academic-variable-formatter skill: greek params (β→$\beta$), super/
subscripts (R²→$R^2$, σ²_(2)→$\sigma^2_{(2)}$), compound terms
(FSTS_c² × DAI_z→$\text{FSTS}_c^2 \times \text{DAI}_z$), operators (≈≤≥±).
Markdown table-row cells (identifier tokens like joint_F_DAI_rich_interactions)
are protected; existing LaTeX equations untouched. Fix a pre-existing source typo
in P5 (\b\beta→\beta, \v\varepsilon→\varepsilon) and replace P6's 8 stray
arrows (→) with words. All 6 papers compile with zero pandoc math warnings;
prose fully converted (0 residual outside tables). Add reusable converter script.
Rebuild EN paper DOCX/PDF + refresh submission bundle.
</commit_message>
<xml_diff>
--- a/dist/HO_SO_NOP/05_BAI_BAO_EN/p4_singapore_en.docx
+++ b/dist/HO_SO_NOP/05_BAI_BAO_EN/p4_singapore_en.docx
@@ -298,7 +298,58 @@
         <w:t xml:space="preserve"> </w:t>
       </w:r>
       <w:r>
-        <w:t xml:space="preserve">This study makes one primary contribution and two supporting contributions. Its primary contribution is to document that foundational digital adoption (DAI) functions as a conditional scaling resource rather than a uniform productivity premium in a digitally advanced economy: the productivity association of Tier 1–2 digital adoption is weak across most of the export-intensity distribution and becomes more positive only in the high-export tail, where cross-border coordination demands are densest. This within-context evidence from Singapore supports a contingent digital complementarity mechanism, with DAI acting as a scaling lever whose value is realised under export-intensity conditions rather than as a broad firm-level capability advantage. The evidence for this mechanism (H3: positive quadratic DAI×FSTS² interaction, β=+3.119, p=.005) is the most distinctive empirical finding, and the one least anticipated by prior literature.</w:t>
+        <w:t xml:space="preserve">This study makes one primary contribution and two supporting contributions. Its primary contribution is to document that foundational digital adoption (DAI) functions as a conditional scaling resource rather than a uniform productivity premium in a digitally advanced economy: the productivity association of Tier 1–2 digital adoption is weak across most of the export-intensity distribution and becomes more positive only in the high-export tail, where cross-border coordination demands are densest. This within-context evidence from Singapore supports a contingent digital complementarity mechanism, with DAI acting as a scaling lever whose value is realised under export-intensity conditions rather than as a broad firm-level capability advantage. The evidence for this mechanism (H3: positive quadratic</w:t>
+      </w:r>
+      <w:r>
+        <w:t xml:space="preserve"> </w:t>
+      </w:r>
+      <m:oMath>
+        <m:r>
+          <m:rPr>
+            <m:nor/>
+            <m:sty m:val="p"/>
+          </m:rPr>
+          <m:t>DAI</m:t>
+        </m:r>
+        <m:r>
+          <m:rPr>
+            <m:sty m:val="p"/>
+          </m:rPr>
+          <m:t>×</m:t>
+        </m:r>
+        <m:sSup>
+          <m:e>
+            <m:r>
+              <m:rPr>
+                <m:nor/>
+                <m:sty m:val="p"/>
+              </m:rPr>
+              <m:t>FSTS</m:t>
+            </m:r>
+          </m:e>
+          <m:sup>
+            <m:r>
+              <m:t>2</m:t>
+            </m:r>
+          </m:sup>
+        </m:sSup>
+      </m:oMath>
+      <w:r>
+        <w:t xml:space="preserve"> </w:t>
+      </w:r>
+      <w:r>
+        <w:t xml:space="preserve">interaction,</w:t>
+      </w:r>
+      <w:r>
+        <w:t xml:space="preserve"> </w:t>
+      </w:r>
+      <m:oMath>
+        <m:r>
+          <m:t>β</m:t>
+        </m:r>
+      </m:oMath>
+      <w:r>
+        <w:t xml:space="preserve">=+3.119, p=.005) is the most distinctive empirical finding, and the one least anticipated by prior literature.</w:t>
       </w:r>
       <w:r>
         <w:t xml:space="preserve"> </w:t>
@@ -587,8 +638,33 @@
       <w:r>
         <w:t xml:space="preserve"> </w:t>
       </w:r>
-      <w:r>
-        <w:t xml:space="preserve">FSTS × DAI interaction: a positive quadratic coefficient is consistent with amplification because it implies that DAI’s productivity contribution grows super-linearly with export-intensity scale, which a level-shift substitution mechanism would not produce.</w:t>
+      <m:oMath>
+        <m:r>
+          <m:rPr>
+            <m:nor/>
+            <m:sty m:val="p"/>
+          </m:rPr>
+          <m:t>FSTS</m:t>
+        </m:r>
+        <m:r>
+          <m:rPr>
+            <m:sty m:val="p"/>
+          </m:rPr>
+          <m:t>×</m:t>
+        </m:r>
+        <m:r>
+          <m:rPr>
+            <m:nor/>
+            <m:sty m:val="p"/>
+          </m:rPr>
+          <m:t>DAI</m:t>
+        </m:r>
+      </m:oMath>
+      <w:r>
+        <w:t xml:space="preserve"> </w:t>
+      </w:r>
+      <w:r>
+        <w:t xml:space="preserve">interaction: a positive quadratic coefficient is consistent with amplification because it implies that DAI’s productivity contribution grows super-linearly with export-intensity scale, which a level-shift substitution mechanism would not produce.</w:t>
       </w:r>
       <w:r>
         <w:t xml:space="preserve"> </w:t>
@@ -641,7 +717,38 @@
         <w:t xml:space="preserve"> </w:t>
       </w:r>
       <w:r>
-        <w:t xml:space="preserve">with export intensity through the quadratic FSTS × DAI interaction, rather than to produce a level shift (substitution) or a selection-driven artefact. This commitment to amplification as the focal mechanism is important for interpretation, because the positive</w:t>
+        <w:t xml:space="preserve">with export intensity through the quadratic</w:t>
+      </w:r>
+      <w:r>
+        <w:t xml:space="preserve"> </w:t>
+      </w:r>
+      <m:oMath>
+        <m:r>
+          <m:rPr>
+            <m:nor/>
+            <m:sty m:val="p"/>
+          </m:rPr>
+          <m:t>FSTS</m:t>
+        </m:r>
+        <m:r>
+          <m:rPr>
+            <m:sty m:val="p"/>
+          </m:rPr>
+          <m:t>×</m:t>
+        </m:r>
+        <m:r>
+          <m:rPr>
+            <m:nor/>
+            <m:sty m:val="p"/>
+          </m:rPr>
+          <m:t>DAI</m:t>
+        </m:r>
+      </m:oMath>
+      <w:r>
+        <w:t xml:space="preserve"> </w:t>
+      </w:r>
+      <w:r>
+        <w:t xml:space="preserve">interaction, rather than to produce a level shift (substitution) or a selection-driven artefact. This commitment to amplification as the focal mechanism is important for interpretation, because the positive</w:t>
       </w:r>
       <w:r>
         <w:t xml:space="preserve"> </w:t>
@@ -773,7 +880,86 @@
         <w:t xml:space="preserve"> </w:t>
       </w:r>
       <w:r>
-        <w:t xml:space="preserve">Solid arrows represent hypothesised direct effects; dashed arrows represent moderating and conditional effects. The independent variable, internationalisation intensity (FSTS, FSTS²_c), is placed at left, and the dependent variable, ln(labour productivity), is placed at right. H1 (inverted-U tendency with support-constrained turning point ~82% FSTS, bootstrap CI [53%, 253%]) is grounded in coordination-cost theory (Hitt et al., 1997); the right-side decline is not formally identified within the observed FSTS range, a theoretically informative result under the saturation framework (Lind–Mehlum p = .303). H1-TCI: technological capability (TCI_z, RBV: Barney, 1991) enters as a direct level-shift to firm performance. H2: DAI (Tier-1+2: website + e-payment) exhibits a non-uniform positive direct effect that varies across export intensity. H3: DAI amplifies the internationalisation-to-performance returns at high FSTS, the primary contingency hypothesis (coordination platform mechanism: Stallkamp &amp; Schotter, 2021; Dynamic Capabilities: Teece, 2007). The Heckman two-step IMR sensitivity check controls exporter selection bias but is not displayed in the figure. (+) denotes positive association. Control variables (ln firm size, age, foreign ownership, sector FE) are included in all empirical models. Note: the H3 amplification test is conducted on the exporters-only subsample (n ≈ 84; power ≈ 16%), and provides a corroborating signal rather than independent identification. ICRV context: Singapore, Advanced I. Data: WBES 2023; N = 623.</w:t>
+        <w:t xml:space="preserve">Solid arrows represent hypothesised direct effects; dashed arrows represent moderating and conditional effects. The independent variable, internationalisation intensity (FSTS,</w:t>
+      </w:r>
+      <w:r>
+        <w:t xml:space="preserve"> </w:t>
+      </w:r>
+      <m:oMath>
+        <m:sSup>
+          <m:e>
+            <m:r>
+              <m:rPr>
+                <m:nor/>
+                <m:sty m:val="p"/>
+              </m:rPr>
+              <m:t>FSTS</m:t>
+            </m:r>
+          </m:e>
+          <m:sup>
+            <m:r>
+              <m:t>2</m:t>
+            </m:r>
+          </m:sup>
+        </m:sSup>
+      </m:oMath>
+      <w:r>
+        <w:t xml:space="preserve">_c), is placed at left, and the dependent variable, ln(labour productivity), is placed at right. H1 (inverted-U tendency with support-constrained turning point ~82% FSTS, bootstrap CI [53%, 253%]) is grounded in coordination-cost theory (Hitt et al., 1997); the right-side decline is not formally identified within the observed FSTS range, a theoretically informative result under the saturation framework (Lind–Mehlum p = .303). H1-TCI: technological capability (</w:t>
+      </w:r>
+      <m:oMath>
+        <m:sSub>
+          <m:e>
+            <m:r>
+              <m:rPr>
+                <m:nor/>
+                <m:sty m:val="p"/>
+              </m:rPr>
+              <m:t>TCI</m:t>
+            </m:r>
+          </m:e>
+          <m:sub>
+            <m:r>
+              <m:t>z</m:t>
+            </m:r>
+          </m:sub>
+        </m:sSub>
+      </m:oMath>
+      <w:r>
+        <w:t xml:space="preserve">, RBV: Barney, 1991) enters as a direct level-shift to firm performance. H2: DAI (Tier-1+2: website + e-payment) exhibits a non-uniform positive direct effect that varies across export intensity. H3: DAI amplifies the internationalisation-to-performance returns at high FSTS, the primary contingency hypothesis (coordination platform mechanism: Stallkamp &amp; Schotter, 2021; Dynamic Capabilities: Teece, 2007). The Heckman two-step IMR sensitivity check controls exporter selection bias but is not displayed in the figure. (+) denotes positive association. Control variables (ln firm size, age, foreign ownership, sector FE) are included in all empirical models. Note: the H3 amplification test is conducted on the exporters-only subsample (n</w:t>
+      </w:r>
+      <w:r>
+        <w:t xml:space="preserve"> </w:t>
+      </w:r>
+      <m:oMath>
+        <m:r>
+          <m:rPr>
+            <m:sty m:val="p"/>
+          </m:rPr>
+          <m:t>≈</m:t>
+        </m:r>
+      </m:oMath>
+      <w:r>
+        <w:t xml:space="preserve"> </w:t>
+      </w:r>
+      <w:r>
+        <w:t xml:space="preserve">84; power</w:t>
+      </w:r>
+      <w:r>
+        <w:t xml:space="preserve"> </w:t>
+      </w:r>
+      <m:oMath>
+        <m:r>
+          <m:rPr>
+            <m:sty m:val="p"/>
+          </m:rPr>
+          <m:t>≈</m:t>
+        </m:r>
+      </m:oMath>
+      <w:r>
+        <w:t xml:space="preserve"> </w:t>
+      </w:r>
+      <w:r>
+        <w:t xml:space="preserve">16%), and provides a corroborating signal rather than independent identification. ICRV context: Singapore, Advanced I. Data: WBES 2023; N = 623.</w:t>
       </w:r>
       <w:r>
         <w:t xml:space="preserve"> </w:t>
@@ -884,7 +1070,84 @@
         <w:t xml:space="preserve"> </w:t>
       </w:r>
       <w:r>
-        <w:t xml:space="preserve">only), restoring the single-item digital-presence measure used in less digitally mature WBES settings (e.g., Vietnam 2009–2015). The key result is that the FSTS²×DAI quadratic interaction coefficient attenuates substantially, from β = +3.119 (p = .005) in the Tier-1+2 specification to a smaller and statistically weaker estimate, while the Tier-1+2 full model’s adjusted R² advantage is also reduced. This pattern is directionally consistent with the theoretical construct-boundary argument developed in Section 1.2 and Section 3.2.3: the conditional-scaling mechanism is empirically legible when DAI captures the Tier-2 transaction-enabling layer (e-payment intensity on both customer and supplier sides), but not when the construct is restricted to the Tier-1 digital-presence indicator alone. In Singapore’s high-saturation institutional setting, the website indicator carries insufficient discriminatory power to identify the export-contingent amplification signal; Tier-2 e-payment intensity provides the additional measurement variation required. The Tier-1-only sensitivity results are available in the Stata replication package (</w:t>
+        <w:t xml:space="preserve">only), restoring the single-item digital-presence measure used in less digitally mature WBES settings (e.g., Vietnam 2009–2015). The key result is that the</w:t>
+      </w:r>
+      <w:r>
+        <w:t xml:space="preserve"> </w:t>
+      </w:r>
+      <m:oMath>
+        <m:sSup>
+          <m:e>
+            <m:r>
+              <m:rPr>
+                <m:nor/>
+                <m:sty m:val="p"/>
+              </m:rPr>
+              <m:t>FSTS</m:t>
+            </m:r>
+          </m:e>
+          <m:sup>
+            <m:r>
+              <m:t>2</m:t>
+            </m:r>
+          </m:sup>
+        </m:sSup>
+        <m:r>
+          <m:rPr>
+            <m:sty m:val="p"/>
+          </m:rPr>
+          <m:t>×</m:t>
+        </m:r>
+        <m:r>
+          <m:rPr>
+            <m:nor/>
+            <m:sty m:val="p"/>
+          </m:rPr>
+          <m:t>DAI</m:t>
+        </m:r>
+      </m:oMath>
+      <w:r>
+        <w:t xml:space="preserve"> </w:t>
+      </w:r>
+      <w:r>
+        <w:t xml:space="preserve">quadratic interaction coefficient attenuates substantially, from</w:t>
+      </w:r>
+      <w:r>
+        <w:t xml:space="preserve"> </w:t>
+      </w:r>
+      <m:oMath>
+        <m:r>
+          <m:t>β</m:t>
+        </m:r>
+      </m:oMath>
+      <w:r>
+        <w:t xml:space="preserve"> </w:t>
+      </w:r>
+      <w:r>
+        <w:t xml:space="preserve">= +3.119 (p = .005) in the Tier-1+2 specification to a smaller and statistically weaker estimate, while the Tier-1+2 full model’s adjusted</w:t>
+      </w:r>
+      <w:r>
+        <w:t xml:space="preserve"> </w:t>
+      </w:r>
+      <m:oMath>
+        <m:sSup>
+          <m:e>
+            <m:r>
+              <m:t>R</m:t>
+            </m:r>
+          </m:e>
+          <m:sup>
+            <m:r>
+              <m:t>2</m:t>
+            </m:r>
+          </m:sup>
+        </m:sSup>
+      </m:oMath>
+      <w:r>
+        <w:t xml:space="preserve"> </w:t>
+      </w:r>
+      <w:r>
+        <w:t xml:space="preserve">advantage is also reduced. This pattern is directionally consistent with the theoretical construct-boundary argument developed in Section 1.2 and Section 3.2.3: the conditional-scaling mechanism is empirically legible when DAI captures the Tier-2 transaction-enabling layer (e-payment intensity on both customer and supplier sides), but not when the construct is restricted to the Tier-1 digital-presence indicator alone. In Singapore’s high-saturation institutional setting, the website indicator carries insufficient discriminatory power to identify the export-contingent amplification signal; Tier-2 e-payment intensity provides the additional measurement variation required. The Tier-1-only sensitivity results are available in the Stata replication package (</w:t>
       </w:r>
       <w:r>
         <w:rPr>
@@ -1634,7 +1897,65 @@
         <w:t xml:space="preserve"> </w:t>
       </w:r>
       <w:r>
-        <w:t xml:space="preserve">ln(LP)ᵢ = α + γ₁ ln(Emp)ᵢ + γ₂ FirmAgeᵢ + γ₃ ForeignOwnᵢ + δ_s + εᵢ</w:t>
+        <w:t xml:space="preserve">ln(LP)ᵢ =</w:t>
+      </w:r>
+      <w:r>
+        <w:t xml:space="preserve"> </w:t>
+      </w:r>
+      <m:oMath>
+        <m:r>
+          <m:t>α</m:t>
+        </m:r>
+      </m:oMath>
+      <w:r>
+        <w:t xml:space="preserve"> </w:t>
+      </w:r>
+      <w:r>
+        <w:t xml:space="preserve">+</w:t>
+      </w:r>
+      <w:r>
+        <w:t xml:space="preserve"> </w:t>
+      </w:r>
+      <m:oMath>
+        <m:r>
+          <m:t>γ</m:t>
+        </m:r>
+      </m:oMath>
+      <w:r>
+        <w:t xml:space="preserve">₁ ln(Emp)ᵢ +</w:t>
+      </w:r>
+      <w:r>
+        <w:t xml:space="preserve"> </w:t>
+      </w:r>
+      <m:oMath>
+        <m:r>
+          <m:t>γ</m:t>
+        </m:r>
+      </m:oMath>
+      <w:r>
+        <w:t xml:space="preserve">₂ FirmAgeᵢ +</w:t>
+      </w:r>
+      <w:r>
+        <w:t xml:space="preserve"> </w:t>
+      </w:r>
+      <m:oMath>
+        <m:r>
+          <m:t>γ</m:t>
+        </m:r>
+      </m:oMath>
+      <w:r>
+        <w:t xml:space="preserve">₃ ForeignOwnᵢ + δ_s +</w:t>
+      </w:r>
+      <w:r>
+        <w:t xml:space="preserve"> </w:t>
+      </w:r>
+      <m:oMath>
+        <m:r>
+          <m:t>ϵ</m:t>
+        </m:r>
+      </m:oMath>
+      <w:r>
+        <w:t xml:space="preserve">ᵢ</w:t>
       </w:r>
     </w:p>
     <w:p>
@@ -1652,7 +1973,84 @@
         <w:t xml:space="preserve"> </w:t>
       </w:r>
       <w:r>
-        <w:t xml:space="preserve">ln(LP)ᵢ = α + β₁ FSTS_cᵢ + γ·Xᵢ + δ_s + εᵢ</w:t>
+        <w:t xml:space="preserve">ln(LP)ᵢ =</w:t>
+      </w:r>
+      <w:r>
+        <w:t xml:space="preserve"> </w:t>
+      </w:r>
+      <m:oMath>
+        <m:r>
+          <m:t>α</m:t>
+        </m:r>
+      </m:oMath>
+      <w:r>
+        <w:t xml:space="preserve"> </w:t>
+      </w:r>
+      <w:r>
+        <w:t xml:space="preserve">+</w:t>
+      </w:r>
+      <w:r>
+        <w:t xml:space="preserve"> </w:t>
+      </w:r>
+      <m:oMath>
+        <m:sSub>
+          <m:e>
+            <m:r>
+              <m:t>β</m:t>
+            </m:r>
+          </m:e>
+          <m:sub>
+            <m:r>
+              <m:t>1</m:t>
+            </m:r>
+          </m:sub>
+        </m:sSub>
+      </m:oMath>
+      <w:r>
+        <w:t xml:space="preserve"> </w:t>
+      </w:r>
+      <m:oMath>
+        <m:sSub>
+          <m:e>
+            <m:r>
+              <m:rPr>
+                <m:nor/>
+                <m:sty m:val="p"/>
+              </m:rPr>
+              <m:t>FSTS</m:t>
+            </m:r>
+          </m:e>
+          <m:sub>
+            <m:r>
+              <m:t>c</m:t>
+            </m:r>
+          </m:sub>
+        </m:sSub>
+      </m:oMath>
+      <w:r>
+        <w:t xml:space="preserve">ᵢ +</w:t>
+      </w:r>
+      <w:r>
+        <w:t xml:space="preserve"> </w:t>
+      </w:r>
+      <m:oMath>
+        <m:r>
+          <m:t>γ</m:t>
+        </m:r>
+      </m:oMath>
+      <w:r>
+        <w:t xml:space="preserve">·Xᵢ + δ_s +</w:t>
+      </w:r>
+      <w:r>
+        <w:t xml:space="preserve"> </w:t>
+      </w:r>
+      <m:oMath>
+        <m:r>
+          <m:t>ϵ</m:t>
+        </m:r>
+      </m:oMath>
+      <w:r>
+        <w:t xml:space="preserve">ᵢ</w:t>
       </w:r>
     </w:p>
     <w:p>
@@ -1670,13 +2068,173 @@
         <w:t xml:space="preserve"> </w:t>
       </w:r>
       <w:r>
-        <w:t xml:space="preserve">ln(LP)ᵢ = α + β₁ FSTS_cᵢ + β₂ FSTS_c²ᵢ + γ·Xᵢ + δ_s + εᵢ</w:t>
-      </w:r>
-      <w:r>
-        <w:t xml:space="preserve"> </w:t>
-      </w:r>
-      <w:r>
-        <w:t xml:space="preserve">Turning point: TP* = −β₁ / (2β₂) + mean(FSTS) [H1: expected TP support-constrained; LM test p = .303]</w:t>
+        <w:t xml:space="preserve">ln(LP)ᵢ =</w:t>
+      </w:r>
+      <w:r>
+        <w:t xml:space="preserve"> </w:t>
+      </w:r>
+      <m:oMath>
+        <m:r>
+          <m:t>α</m:t>
+        </m:r>
+      </m:oMath>
+      <w:r>
+        <w:t xml:space="preserve"> </w:t>
+      </w:r>
+      <w:r>
+        <w:t xml:space="preserve">+</w:t>
+      </w:r>
+      <w:r>
+        <w:t xml:space="preserve"> </w:t>
+      </w:r>
+      <m:oMath>
+        <m:sSub>
+          <m:e>
+            <m:r>
+              <m:t>β</m:t>
+            </m:r>
+          </m:e>
+          <m:sub>
+            <m:r>
+              <m:t>1</m:t>
+            </m:r>
+          </m:sub>
+        </m:sSub>
+      </m:oMath>
+      <w:r>
+        <w:t xml:space="preserve"> </w:t>
+      </w:r>
+      <m:oMath>
+        <m:sSub>
+          <m:e>
+            <m:r>
+              <m:rPr>
+                <m:nor/>
+                <m:sty m:val="p"/>
+              </m:rPr>
+              <m:t>FSTS</m:t>
+            </m:r>
+          </m:e>
+          <m:sub>
+            <m:r>
+              <m:t>c</m:t>
+            </m:r>
+          </m:sub>
+        </m:sSub>
+      </m:oMath>
+      <w:r>
+        <w:t xml:space="preserve">ᵢ +</w:t>
+      </w:r>
+      <w:r>
+        <w:t xml:space="preserve"> </w:t>
+      </w:r>
+      <m:oMath>
+        <m:sSub>
+          <m:e>
+            <m:r>
+              <m:t>β</m:t>
+            </m:r>
+          </m:e>
+          <m:sub>
+            <m:r>
+              <m:t>2</m:t>
+            </m:r>
+          </m:sub>
+        </m:sSub>
+      </m:oMath>
+      <w:r>
+        <w:t xml:space="preserve"> </w:t>
+      </w:r>
+      <m:oMath>
+        <m:sSubSup>
+          <m:e>
+            <m:r>
+              <m:rPr>
+                <m:nor/>
+                <m:sty m:val="p"/>
+              </m:rPr>
+              <m:t>FSTS</m:t>
+            </m:r>
+          </m:e>
+          <m:sub>
+            <m:r>
+              <m:t>c</m:t>
+            </m:r>
+          </m:sub>
+          <m:sup>
+            <m:r>
+              <m:t>2</m:t>
+            </m:r>
+          </m:sup>
+        </m:sSubSup>
+      </m:oMath>
+      <w:r>
+        <w:t xml:space="preserve">ᵢ +</w:t>
+      </w:r>
+      <w:r>
+        <w:t xml:space="preserve"> </w:t>
+      </w:r>
+      <m:oMath>
+        <m:r>
+          <m:t>γ</m:t>
+        </m:r>
+      </m:oMath>
+      <w:r>
+        <w:t xml:space="preserve">·Xᵢ + δ_s +</w:t>
+      </w:r>
+      <w:r>
+        <w:t xml:space="preserve"> </w:t>
+      </w:r>
+      <m:oMath>
+        <m:r>
+          <m:t>ϵ</m:t>
+        </m:r>
+      </m:oMath>
+      <w:r>
+        <w:t xml:space="preserve">ᵢ</w:t>
+      </w:r>
+      <w:r>
+        <w:t xml:space="preserve"> </w:t>
+      </w:r>
+      <w:r>
+        <w:t xml:space="preserve">Turning point: TP* = −</w:t>
+      </w:r>
+      <m:oMath>
+        <m:sSub>
+          <m:e>
+            <m:r>
+              <m:t>β</m:t>
+            </m:r>
+          </m:e>
+          <m:sub>
+            <m:r>
+              <m:t>1</m:t>
+            </m:r>
+          </m:sub>
+        </m:sSub>
+      </m:oMath>
+      <w:r>
+        <w:t xml:space="preserve"> </w:t>
+      </w:r>
+      <w:r>
+        <w:t xml:space="preserve">/ (2</w:t>
+      </w:r>
+      <m:oMath>
+        <m:sSub>
+          <m:e>
+            <m:r>
+              <m:t>β</m:t>
+            </m:r>
+          </m:e>
+          <m:sub>
+            <m:r>
+              <m:t>2</m:t>
+            </m:r>
+          </m:sub>
+        </m:sSub>
+      </m:oMath>
+      <w:r>
+        <w:t xml:space="preserve">) + mean(FSTS) [H1: expected TP support-constrained; LM test p = .303]</w:t>
       </w:r>
     </w:p>
     <w:p>
@@ -1694,7 +2252,171 @@
         <w:t xml:space="preserve"> </w:t>
       </w:r>
       <w:r>
-        <w:t xml:space="preserve">ln(LP)ᵢ = α + β₁ FSTS_cᵢ + β₂ FSTS_c²ᵢ + β₃ TCI_zᵢ + γ·Xᵢ + δ_s + εᵢ</w:t>
+        <w:t xml:space="preserve">ln(LP)ᵢ =</w:t>
+      </w:r>
+      <w:r>
+        <w:t xml:space="preserve"> </w:t>
+      </w:r>
+      <m:oMath>
+        <m:r>
+          <m:t>α</m:t>
+        </m:r>
+      </m:oMath>
+      <w:r>
+        <w:t xml:space="preserve"> </w:t>
+      </w:r>
+      <w:r>
+        <w:t xml:space="preserve">+</w:t>
+      </w:r>
+      <w:r>
+        <w:t xml:space="preserve"> </w:t>
+      </w:r>
+      <m:oMath>
+        <m:sSub>
+          <m:e>
+            <m:r>
+              <m:t>β</m:t>
+            </m:r>
+          </m:e>
+          <m:sub>
+            <m:r>
+              <m:t>1</m:t>
+            </m:r>
+          </m:sub>
+        </m:sSub>
+      </m:oMath>
+      <w:r>
+        <w:t xml:space="preserve"> </w:t>
+      </w:r>
+      <m:oMath>
+        <m:sSub>
+          <m:e>
+            <m:r>
+              <m:rPr>
+                <m:nor/>
+                <m:sty m:val="p"/>
+              </m:rPr>
+              <m:t>FSTS</m:t>
+            </m:r>
+          </m:e>
+          <m:sub>
+            <m:r>
+              <m:t>c</m:t>
+            </m:r>
+          </m:sub>
+        </m:sSub>
+      </m:oMath>
+      <w:r>
+        <w:t xml:space="preserve">ᵢ +</w:t>
+      </w:r>
+      <w:r>
+        <w:t xml:space="preserve"> </w:t>
+      </w:r>
+      <m:oMath>
+        <m:sSub>
+          <m:e>
+            <m:r>
+              <m:t>β</m:t>
+            </m:r>
+          </m:e>
+          <m:sub>
+            <m:r>
+              <m:t>2</m:t>
+            </m:r>
+          </m:sub>
+        </m:sSub>
+      </m:oMath>
+      <w:r>
+        <w:t xml:space="preserve"> </w:t>
+      </w:r>
+      <m:oMath>
+        <m:sSubSup>
+          <m:e>
+            <m:r>
+              <m:rPr>
+                <m:nor/>
+                <m:sty m:val="p"/>
+              </m:rPr>
+              <m:t>FSTS</m:t>
+            </m:r>
+          </m:e>
+          <m:sub>
+            <m:r>
+              <m:t>c</m:t>
+            </m:r>
+          </m:sub>
+          <m:sup>
+            <m:r>
+              <m:t>2</m:t>
+            </m:r>
+          </m:sup>
+        </m:sSubSup>
+      </m:oMath>
+      <w:r>
+        <w:t xml:space="preserve">ᵢ +</w:t>
+      </w:r>
+      <w:r>
+        <w:t xml:space="preserve"> </w:t>
+      </w:r>
+      <m:oMath>
+        <m:sSub>
+          <m:e>
+            <m:r>
+              <m:t>β</m:t>
+            </m:r>
+          </m:e>
+          <m:sub>
+            <m:r>
+              <m:t>3</m:t>
+            </m:r>
+          </m:sub>
+        </m:sSub>
+      </m:oMath>
+      <w:r>
+        <w:t xml:space="preserve"> </w:t>
+      </w:r>
+      <m:oMath>
+        <m:sSub>
+          <m:e>
+            <m:r>
+              <m:rPr>
+                <m:nor/>
+                <m:sty m:val="p"/>
+              </m:rPr>
+              <m:t>TCI</m:t>
+            </m:r>
+          </m:e>
+          <m:sub>
+            <m:r>
+              <m:t>z</m:t>
+            </m:r>
+          </m:sub>
+        </m:sSub>
+      </m:oMath>
+      <w:r>
+        <w:t xml:space="preserve">ᵢ +</w:t>
+      </w:r>
+      <w:r>
+        <w:t xml:space="preserve"> </w:t>
+      </w:r>
+      <m:oMath>
+        <m:r>
+          <m:t>γ</m:t>
+        </m:r>
+      </m:oMath>
+      <w:r>
+        <w:t xml:space="preserve">·Xᵢ + δ_s +</w:t>
+      </w:r>
+      <w:r>
+        <w:t xml:space="preserve"> </w:t>
+      </w:r>
+      <m:oMath>
+        <m:r>
+          <m:t>ϵ</m:t>
+        </m:r>
+      </m:oMath>
+      <w:r>
+        <w:t xml:space="preserve">ᵢ</w:t>
       </w:r>
     </w:p>
     <w:p>
@@ -1712,7 +2434,328 @@
         <w:t xml:space="preserve"> </w:t>
       </w:r>
       <w:r>
-        <w:t xml:space="preserve">ln(LP)ᵢ = α + β₁ FSTS_cᵢ + β₂ FSTS_c²ᵢ + β₃ TCI_zᵢ + β₄(FSTS_cᵢ × TCI_zᵢ) + β₅(FSTS_c²ᵢ × TCI_zᵢ) + γ·Xᵢ + δ_s + εᵢ</w:t>
+        <w:t xml:space="preserve">ln(LP)ᵢ =</w:t>
+      </w:r>
+      <w:r>
+        <w:t xml:space="preserve"> </w:t>
+      </w:r>
+      <m:oMath>
+        <m:r>
+          <m:t>α</m:t>
+        </m:r>
+      </m:oMath>
+      <w:r>
+        <w:t xml:space="preserve"> </w:t>
+      </w:r>
+      <w:r>
+        <w:t xml:space="preserve">+</w:t>
+      </w:r>
+      <w:r>
+        <w:t xml:space="preserve"> </w:t>
+      </w:r>
+      <m:oMath>
+        <m:sSub>
+          <m:e>
+            <m:r>
+              <m:t>β</m:t>
+            </m:r>
+          </m:e>
+          <m:sub>
+            <m:r>
+              <m:t>1</m:t>
+            </m:r>
+          </m:sub>
+        </m:sSub>
+      </m:oMath>
+      <w:r>
+        <w:t xml:space="preserve"> </w:t>
+      </w:r>
+      <m:oMath>
+        <m:sSub>
+          <m:e>
+            <m:r>
+              <m:rPr>
+                <m:nor/>
+                <m:sty m:val="p"/>
+              </m:rPr>
+              <m:t>FSTS</m:t>
+            </m:r>
+          </m:e>
+          <m:sub>
+            <m:r>
+              <m:t>c</m:t>
+            </m:r>
+          </m:sub>
+        </m:sSub>
+      </m:oMath>
+      <w:r>
+        <w:t xml:space="preserve">ᵢ +</w:t>
+      </w:r>
+      <w:r>
+        <w:t xml:space="preserve"> </w:t>
+      </w:r>
+      <m:oMath>
+        <m:sSub>
+          <m:e>
+            <m:r>
+              <m:t>β</m:t>
+            </m:r>
+          </m:e>
+          <m:sub>
+            <m:r>
+              <m:t>2</m:t>
+            </m:r>
+          </m:sub>
+        </m:sSub>
+      </m:oMath>
+      <w:r>
+        <w:t xml:space="preserve"> </w:t>
+      </w:r>
+      <m:oMath>
+        <m:sSubSup>
+          <m:e>
+            <m:r>
+              <m:rPr>
+                <m:nor/>
+                <m:sty m:val="p"/>
+              </m:rPr>
+              <m:t>FSTS</m:t>
+            </m:r>
+          </m:e>
+          <m:sub>
+            <m:r>
+              <m:t>c</m:t>
+            </m:r>
+          </m:sub>
+          <m:sup>
+            <m:r>
+              <m:t>2</m:t>
+            </m:r>
+          </m:sup>
+        </m:sSubSup>
+      </m:oMath>
+      <w:r>
+        <w:t xml:space="preserve">ᵢ +</w:t>
+      </w:r>
+      <w:r>
+        <w:t xml:space="preserve"> </w:t>
+      </w:r>
+      <m:oMath>
+        <m:sSub>
+          <m:e>
+            <m:r>
+              <m:t>β</m:t>
+            </m:r>
+          </m:e>
+          <m:sub>
+            <m:r>
+              <m:t>3</m:t>
+            </m:r>
+          </m:sub>
+        </m:sSub>
+      </m:oMath>
+      <w:r>
+        <w:t xml:space="preserve"> </w:t>
+      </w:r>
+      <m:oMath>
+        <m:sSub>
+          <m:e>
+            <m:r>
+              <m:rPr>
+                <m:nor/>
+                <m:sty m:val="p"/>
+              </m:rPr>
+              <m:t>TCI</m:t>
+            </m:r>
+          </m:e>
+          <m:sub>
+            <m:r>
+              <m:t>z</m:t>
+            </m:r>
+          </m:sub>
+        </m:sSub>
+      </m:oMath>
+      <w:r>
+        <w:t xml:space="preserve">ᵢ +</w:t>
+      </w:r>
+      <w:r>
+        <w:t xml:space="preserve"> </w:t>
+      </w:r>
+      <m:oMath>
+        <m:sSub>
+          <m:e>
+            <m:r>
+              <m:t>β</m:t>
+            </m:r>
+          </m:e>
+          <m:sub>
+            <m:r>
+              <m:t>4</m:t>
+            </m:r>
+          </m:sub>
+        </m:sSub>
+      </m:oMath>
+      <w:r>
+        <w:t xml:space="preserve">(</w:t>
+      </w:r>
+      <m:oMath>
+        <m:sSub>
+          <m:e>
+            <m:r>
+              <m:rPr>
+                <m:nor/>
+                <m:sty m:val="p"/>
+              </m:rPr>
+              <m:t>FSTS</m:t>
+            </m:r>
+          </m:e>
+          <m:sub>
+            <m:r>
+              <m:t>c</m:t>
+            </m:r>
+          </m:sub>
+        </m:sSub>
+      </m:oMath>
+      <w:r>
+        <w:t xml:space="preserve">ᵢ</w:t>
+      </w:r>
+      <w:r>
+        <w:t xml:space="preserve"> </w:t>
+      </w:r>
+      <m:oMath>
+        <m:r>
+          <m:rPr>
+            <m:sty m:val="p"/>
+          </m:rPr>
+          <m:t>×</m:t>
+        </m:r>
+      </m:oMath>
+      <w:r>
+        <w:t xml:space="preserve"> </w:t>
+      </w:r>
+      <m:oMath>
+        <m:sSub>
+          <m:e>
+            <m:r>
+              <m:rPr>
+                <m:nor/>
+                <m:sty m:val="p"/>
+              </m:rPr>
+              <m:t>TCI</m:t>
+            </m:r>
+          </m:e>
+          <m:sub>
+            <m:r>
+              <m:t>z</m:t>
+            </m:r>
+          </m:sub>
+        </m:sSub>
+      </m:oMath>
+      <w:r>
+        <w:t xml:space="preserve">ᵢ) +</w:t>
+      </w:r>
+      <w:r>
+        <w:t xml:space="preserve"> </w:t>
+      </w:r>
+      <m:oMath>
+        <m:sSub>
+          <m:e>
+            <m:r>
+              <m:t>β</m:t>
+            </m:r>
+          </m:e>
+          <m:sub>
+            <m:r>
+              <m:t>5</m:t>
+            </m:r>
+          </m:sub>
+        </m:sSub>
+      </m:oMath>
+      <w:r>
+        <w:t xml:space="preserve">(</w:t>
+      </w:r>
+      <m:oMath>
+        <m:sSubSup>
+          <m:e>
+            <m:r>
+              <m:rPr>
+                <m:nor/>
+                <m:sty m:val="p"/>
+              </m:rPr>
+              <m:t>FSTS</m:t>
+            </m:r>
+          </m:e>
+          <m:sub>
+            <m:r>
+              <m:t>c</m:t>
+            </m:r>
+          </m:sub>
+          <m:sup>
+            <m:r>
+              <m:t>2</m:t>
+            </m:r>
+          </m:sup>
+        </m:sSubSup>
+      </m:oMath>
+      <w:r>
+        <w:t xml:space="preserve">ᵢ</w:t>
+      </w:r>
+      <w:r>
+        <w:t xml:space="preserve"> </w:t>
+      </w:r>
+      <m:oMath>
+        <m:r>
+          <m:rPr>
+            <m:sty m:val="p"/>
+          </m:rPr>
+          <m:t>×</m:t>
+        </m:r>
+      </m:oMath>
+      <w:r>
+        <w:t xml:space="preserve"> </w:t>
+      </w:r>
+      <m:oMath>
+        <m:sSub>
+          <m:e>
+            <m:r>
+              <m:rPr>
+                <m:nor/>
+                <m:sty m:val="p"/>
+              </m:rPr>
+              <m:t>TCI</m:t>
+            </m:r>
+          </m:e>
+          <m:sub>
+            <m:r>
+              <m:t>z</m:t>
+            </m:r>
+          </m:sub>
+        </m:sSub>
+      </m:oMath>
+      <w:r>
+        <w:t xml:space="preserve">ᵢ) +</w:t>
+      </w:r>
+      <w:r>
+        <w:t xml:space="preserve"> </w:t>
+      </w:r>
+      <m:oMath>
+        <m:r>
+          <m:t>γ</m:t>
+        </m:r>
+      </m:oMath>
+      <w:r>
+        <w:t xml:space="preserve">·Xᵢ + δ_s +</w:t>
+      </w:r>
+      <w:r>
+        <w:t xml:space="preserve"> </w:t>
+      </w:r>
+      <m:oMath>
+        <m:r>
+          <m:t>ϵ</m:t>
+        </m:r>
+      </m:oMath>
+      <w:r>
+        <w:t xml:space="preserve">ᵢ</w:t>
       </w:r>
     </w:p>
     <w:p>
@@ -1730,7 +2773,171 @@
         <w:t xml:space="preserve"> </w:t>
       </w:r>
       <w:r>
-        <w:t xml:space="preserve">ln(LP)ᵢ = α + β₁ FSTS_cᵢ + β₂ FSTS_c²ᵢ + β₃ DAI_zᵢ + γ·Xᵢ + δ_s + εᵢ</w:t>
+        <w:t xml:space="preserve">ln(LP)ᵢ =</w:t>
+      </w:r>
+      <w:r>
+        <w:t xml:space="preserve"> </w:t>
+      </w:r>
+      <m:oMath>
+        <m:r>
+          <m:t>α</m:t>
+        </m:r>
+      </m:oMath>
+      <w:r>
+        <w:t xml:space="preserve"> </w:t>
+      </w:r>
+      <w:r>
+        <w:t xml:space="preserve">+</w:t>
+      </w:r>
+      <w:r>
+        <w:t xml:space="preserve"> </w:t>
+      </w:r>
+      <m:oMath>
+        <m:sSub>
+          <m:e>
+            <m:r>
+              <m:t>β</m:t>
+            </m:r>
+          </m:e>
+          <m:sub>
+            <m:r>
+              <m:t>1</m:t>
+            </m:r>
+          </m:sub>
+        </m:sSub>
+      </m:oMath>
+      <w:r>
+        <w:t xml:space="preserve"> </w:t>
+      </w:r>
+      <m:oMath>
+        <m:sSub>
+          <m:e>
+            <m:r>
+              <m:rPr>
+                <m:nor/>
+                <m:sty m:val="p"/>
+              </m:rPr>
+              <m:t>FSTS</m:t>
+            </m:r>
+          </m:e>
+          <m:sub>
+            <m:r>
+              <m:t>c</m:t>
+            </m:r>
+          </m:sub>
+        </m:sSub>
+      </m:oMath>
+      <w:r>
+        <w:t xml:space="preserve">ᵢ +</w:t>
+      </w:r>
+      <w:r>
+        <w:t xml:space="preserve"> </w:t>
+      </w:r>
+      <m:oMath>
+        <m:sSub>
+          <m:e>
+            <m:r>
+              <m:t>β</m:t>
+            </m:r>
+          </m:e>
+          <m:sub>
+            <m:r>
+              <m:t>2</m:t>
+            </m:r>
+          </m:sub>
+        </m:sSub>
+      </m:oMath>
+      <w:r>
+        <w:t xml:space="preserve"> </w:t>
+      </w:r>
+      <m:oMath>
+        <m:sSubSup>
+          <m:e>
+            <m:r>
+              <m:rPr>
+                <m:nor/>
+                <m:sty m:val="p"/>
+              </m:rPr>
+              <m:t>FSTS</m:t>
+            </m:r>
+          </m:e>
+          <m:sub>
+            <m:r>
+              <m:t>c</m:t>
+            </m:r>
+          </m:sub>
+          <m:sup>
+            <m:r>
+              <m:t>2</m:t>
+            </m:r>
+          </m:sup>
+        </m:sSubSup>
+      </m:oMath>
+      <w:r>
+        <w:t xml:space="preserve">ᵢ +</w:t>
+      </w:r>
+      <w:r>
+        <w:t xml:space="preserve"> </w:t>
+      </w:r>
+      <m:oMath>
+        <m:sSub>
+          <m:e>
+            <m:r>
+              <m:t>β</m:t>
+            </m:r>
+          </m:e>
+          <m:sub>
+            <m:r>
+              <m:t>3</m:t>
+            </m:r>
+          </m:sub>
+        </m:sSub>
+      </m:oMath>
+      <w:r>
+        <w:t xml:space="preserve"> </w:t>
+      </w:r>
+      <m:oMath>
+        <m:sSub>
+          <m:e>
+            <m:r>
+              <m:rPr>
+                <m:nor/>
+                <m:sty m:val="p"/>
+              </m:rPr>
+              <m:t>DAI</m:t>
+            </m:r>
+          </m:e>
+          <m:sub>
+            <m:r>
+              <m:t>z</m:t>
+            </m:r>
+          </m:sub>
+        </m:sSub>
+      </m:oMath>
+      <w:r>
+        <w:t xml:space="preserve">ᵢ +</w:t>
+      </w:r>
+      <w:r>
+        <w:t xml:space="preserve"> </w:t>
+      </w:r>
+      <m:oMath>
+        <m:r>
+          <m:t>γ</m:t>
+        </m:r>
+      </m:oMath>
+      <w:r>
+        <w:t xml:space="preserve">·Xᵢ + δ_s +</w:t>
+      </w:r>
+      <w:r>
+        <w:t xml:space="preserve"> </w:t>
+      </w:r>
+      <m:oMath>
+        <m:r>
+          <m:t>ϵ</m:t>
+        </m:r>
+      </m:oMath>
+      <w:r>
+        <w:t xml:space="preserve">ᵢ</w:t>
       </w:r>
     </w:p>
     <w:p>
@@ -1748,7 +2955,212 @@
         <w:t xml:space="preserve"> </w:t>
       </w:r>
       <w:r>
-        <w:t xml:space="preserve">ln(LP)ᵢ = α + β₁ FSTS_cᵢ + β₂ FSTS_c²ᵢ + β₃ TCI_zᵢ + β₄ DAI_zᵢ + γ·Xᵢ + δ_s + εᵢ</w:t>
+        <w:t xml:space="preserve">ln(LP)ᵢ =</w:t>
+      </w:r>
+      <w:r>
+        <w:t xml:space="preserve"> </w:t>
+      </w:r>
+      <m:oMath>
+        <m:r>
+          <m:t>α</m:t>
+        </m:r>
+      </m:oMath>
+      <w:r>
+        <w:t xml:space="preserve"> </w:t>
+      </w:r>
+      <w:r>
+        <w:t xml:space="preserve">+</w:t>
+      </w:r>
+      <w:r>
+        <w:t xml:space="preserve"> </w:t>
+      </w:r>
+      <m:oMath>
+        <m:sSub>
+          <m:e>
+            <m:r>
+              <m:t>β</m:t>
+            </m:r>
+          </m:e>
+          <m:sub>
+            <m:r>
+              <m:t>1</m:t>
+            </m:r>
+          </m:sub>
+        </m:sSub>
+      </m:oMath>
+      <w:r>
+        <w:t xml:space="preserve"> </w:t>
+      </w:r>
+      <m:oMath>
+        <m:sSub>
+          <m:e>
+            <m:r>
+              <m:rPr>
+                <m:nor/>
+                <m:sty m:val="p"/>
+              </m:rPr>
+              <m:t>FSTS</m:t>
+            </m:r>
+          </m:e>
+          <m:sub>
+            <m:r>
+              <m:t>c</m:t>
+            </m:r>
+          </m:sub>
+        </m:sSub>
+      </m:oMath>
+      <w:r>
+        <w:t xml:space="preserve">ᵢ +</w:t>
+      </w:r>
+      <w:r>
+        <w:t xml:space="preserve"> </w:t>
+      </w:r>
+      <m:oMath>
+        <m:sSub>
+          <m:e>
+            <m:r>
+              <m:t>β</m:t>
+            </m:r>
+          </m:e>
+          <m:sub>
+            <m:r>
+              <m:t>2</m:t>
+            </m:r>
+          </m:sub>
+        </m:sSub>
+      </m:oMath>
+      <w:r>
+        <w:t xml:space="preserve"> </w:t>
+      </w:r>
+      <m:oMath>
+        <m:sSubSup>
+          <m:e>
+            <m:r>
+              <m:rPr>
+                <m:nor/>
+                <m:sty m:val="p"/>
+              </m:rPr>
+              <m:t>FSTS</m:t>
+            </m:r>
+          </m:e>
+          <m:sub>
+            <m:r>
+              <m:t>c</m:t>
+            </m:r>
+          </m:sub>
+          <m:sup>
+            <m:r>
+              <m:t>2</m:t>
+            </m:r>
+          </m:sup>
+        </m:sSubSup>
+      </m:oMath>
+      <w:r>
+        <w:t xml:space="preserve">ᵢ +</w:t>
+      </w:r>
+      <w:r>
+        <w:t xml:space="preserve"> </w:t>
+      </w:r>
+      <m:oMath>
+        <m:sSub>
+          <m:e>
+            <m:r>
+              <m:t>β</m:t>
+            </m:r>
+          </m:e>
+          <m:sub>
+            <m:r>
+              <m:t>3</m:t>
+            </m:r>
+          </m:sub>
+        </m:sSub>
+      </m:oMath>
+      <w:r>
+        <w:t xml:space="preserve"> </w:t>
+      </w:r>
+      <m:oMath>
+        <m:sSub>
+          <m:e>
+            <m:r>
+              <m:rPr>
+                <m:nor/>
+                <m:sty m:val="p"/>
+              </m:rPr>
+              <m:t>TCI</m:t>
+            </m:r>
+          </m:e>
+          <m:sub>
+            <m:r>
+              <m:t>z</m:t>
+            </m:r>
+          </m:sub>
+        </m:sSub>
+      </m:oMath>
+      <w:r>
+        <w:t xml:space="preserve">ᵢ +</w:t>
+      </w:r>
+      <w:r>
+        <w:t xml:space="preserve"> </w:t>
+      </w:r>
+      <m:oMath>
+        <m:sSub>
+          <m:e>
+            <m:r>
+              <m:t>β</m:t>
+            </m:r>
+          </m:e>
+          <m:sub>
+            <m:r>
+              <m:t>4</m:t>
+            </m:r>
+          </m:sub>
+        </m:sSub>
+      </m:oMath>
+      <w:r>
+        <w:t xml:space="preserve"> </w:t>
+      </w:r>
+      <m:oMath>
+        <m:sSub>
+          <m:e>
+            <m:r>
+              <m:rPr>
+                <m:nor/>
+                <m:sty m:val="p"/>
+              </m:rPr>
+              <m:t>DAI</m:t>
+            </m:r>
+          </m:e>
+          <m:sub>
+            <m:r>
+              <m:t>z</m:t>
+            </m:r>
+          </m:sub>
+        </m:sSub>
+      </m:oMath>
+      <w:r>
+        <w:t xml:space="preserve">ᵢ +</w:t>
+      </w:r>
+      <w:r>
+        <w:t xml:space="preserve"> </w:t>
+      </w:r>
+      <m:oMath>
+        <m:r>
+          <m:t>γ</m:t>
+        </m:r>
+      </m:oMath>
+      <w:r>
+        <w:t xml:space="preserve">·Xᵢ + δ_s +</w:t>
+      </w:r>
+      <w:r>
+        <w:t xml:space="preserve"> </w:t>
+      </w:r>
+      <m:oMath>
+        <m:r>
+          <m:t>ϵ</m:t>
+        </m:r>
+      </m:oMath>
+      <w:r>
+        <w:t xml:space="preserve">ᵢ</w:t>
       </w:r>
     </w:p>
     <w:p>
@@ -1766,7 +3178,288 @@
         <w:t xml:space="preserve"> </w:t>
       </w:r>
       <w:r>
-        <w:t xml:space="preserve">ln(LP)ᵢ = α + β₁ FSTS_cᵢ + β₂ FSTS_c²ᵢ + β₃ TCI_zᵢ + β₄ DAI_zᵢ + β₅(FSTS_cᵢ × DAI_zᵢ) + γ·Xᵢ + δ_s + εᵢ</w:t>
+        <w:t xml:space="preserve">ln(LP)ᵢ =</w:t>
+      </w:r>
+      <w:r>
+        <w:t xml:space="preserve"> </w:t>
+      </w:r>
+      <m:oMath>
+        <m:r>
+          <m:t>α</m:t>
+        </m:r>
+      </m:oMath>
+      <w:r>
+        <w:t xml:space="preserve"> </w:t>
+      </w:r>
+      <w:r>
+        <w:t xml:space="preserve">+</w:t>
+      </w:r>
+      <w:r>
+        <w:t xml:space="preserve"> </w:t>
+      </w:r>
+      <m:oMath>
+        <m:sSub>
+          <m:e>
+            <m:r>
+              <m:t>β</m:t>
+            </m:r>
+          </m:e>
+          <m:sub>
+            <m:r>
+              <m:t>1</m:t>
+            </m:r>
+          </m:sub>
+        </m:sSub>
+      </m:oMath>
+      <w:r>
+        <w:t xml:space="preserve"> </w:t>
+      </w:r>
+      <m:oMath>
+        <m:sSub>
+          <m:e>
+            <m:r>
+              <m:rPr>
+                <m:nor/>
+                <m:sty m:val="p"/>
+              </m:rPr>
+              <m:t>FSTS</m:t>
+            </m:r>
+          </m:e>
+          <m:sub>
+            <m:r>
+              <m:t>c</m:t>
+            </m:r>
+          </m:sub>
+        </m:sSub>
+      </m:oMath>
+      <w:r>
+        <w:t xml:space="preserve">ᵢ +</w:t>
+      </w:r>
+      <w:r>
+        <w:t xml:space="preserve"> </w:t>
+      </w:r>
+      <m:oMath>
+        <m:sSub>
+          <m:e>
+            <m:r>
+              <m:t>β</m:t>
+            </m:r>
+          </m:e>
+          <m:sub>
+            <m:r>
+              <m:t>2</m:t>
+            </m:r>
+          </m:sub>
+        </m:sSub>
+      </m:oMath>
+      <w:r>
+        <w:t xml:space="preserve"> </w:t>
+      </w:r>
+      <m:oMath>
+        <m:sSubSup>
+          <m:e>
+            <m:r>
+              <m:rPr>
+                <m:nor/>
+                <m:sty m:val="p"/>
+              </m:rPr>
+              <m:t>FSTS</m:t>
+            </m:r>
+          </m:e>
+          <m:sub>
+            <m:r>
+              <m:t>c</m:t>
+            </m:r>
+          </m:sub>
+          <m:sup>
+            <m:r>
+              <m:t>2</m:t>
+            </m:r>
+          </m:sup>
+        </m:sSubSup>
+      </m:oMath>
+      <w:r>
+        <w:t xml:space="preserve">ᵢ +</w:t>
+      </w:r>
+      <w:r>
+        <w:t xml:space="preserve"> </w:t>
+      </w:r>
+      <m:oMath>
+        <m:sSub>
+          <m:e>
+            <m:r>
+              <m:t>β</m:t>
+            </m:r>
+          </m:e>
+          <m:sub>
+            <m:r>
+              <m:t>3</m:t>
+            </m:r>
+          </m:sub>
+        </m:sSub>
+      </m:oMath>
+      <w:r>
+        <w:t xml:space="preserve"> </w:t>
+      </w:r>
+      <m:oMath>
+        <m:sSub>
+          <m:e>
+            <m:r>
+              <m:rPr>
+                <m:nor/>
+                <m:sty m:val="p"/>
+              </m:rPr>
+              <m:t>TCI</m:t>
+            </m:r>
+          </m:e>
+          <m:sub>
+            <m:r>
+              <m:t>z</m:t>
+            </m:r>
+          </m:sub>
+        </m:sSub>
+      </m:oMath>
+      <w:r>
+        <w:t xml:space="preserve">ᵢ +</w:t>
+      </w:r>
+      <w:r>
+        <w:t xml:space="preserve"> </w:t>
+      </w:r>
+      <m:oMath>
+        <m:sSub>
+          <m:e>
+            <m:r>
+              <m:t>β</m:t>
+            </m:r>
+          </m:e>
+          <m:sub>
+            <m:r>
+              <m:t>4</m:t>
+            </m:r>
+          </m:sub>
+        </m:sSub>
+      </m:oMath>
+      <w:r>
+        <w:t xml:space="preserve"> </w:t>
+      </w:r>
+      <m:oMath>
+        <m:sSub>
+          <m:e>
+            <m:r>
+              <m:rPr>
+                <m:nor/>
+                <m:sty m:val="p"/>
+              </m:rPr>
+              <m:t>DAI</m:t>
+            </m:r>
+          </m:e>
+          <m:sub>
+            <m:r>
+              <m:t>z</m:t>
+            </m:r>
+          </m:sub>
+        </m:sSub>
+      </m:oMath>
+      <w:r>
+        <w:t xml:space="preserve">ᵢ +</w:t>
+      </w:r>
+      <w:r>
+        <w:t xml:space="preserve"> </w:t>
+      </w:r>
+      <m:oMath>
+        <m:sSub>
+          <m:e>
+            <m:r>
+              <m:t>β</m:t>
+            </m:r>
+          </m:e>
+          <m:sub>
+            <m:r>
+              <m:t>5</m:t>
+            </m:r>
+          </m:sub>
+        </m:sSub>
+      </m:oMath>
+      <w:r>
+        <w:t xml:space="preserve">(</w:t>
+      </w:r>
+      <m:oMath>
+        <m:sSub>
+          <m:e>
+            <m:r>
+              <m:rPr>
+                <m:nor/>
+                <m:sty m:val="p"/>
+              </m:rPr>
+              <m:t>FSTS</m:t>
+            </m:r>
+          </m:e>
+          <m:sub>
+            <m:r>
+              <m:t>c</m:t>
+            </m:r>
+          </m:sub>
+        </m:sSub>
+      </m:oMath>
+      <w:r>
+        <w:t xml:space="preserve">ᵢ</w:t>
+      </w:r>
+      <w:r>
+        <w:t xml:space="preserve"> </w:t>
+      </w:r>
+      <m:oMath>
+        <m:r>
+          <m:rPr>
+            <m:sty m:val="p"/>
+          </m:rPr>
+          <m:t>×</m:t>
+        </m:r>
+      </m:oMath>
+      <w:r>
+        <w:t xml:space="preserve"> </w:t>
+      </w:r>
+      <m:oMath>
+        <m:sSub>
+          <m:e>
+            <m:r>
+              <m:rPr>
+                <m:nor/>
+                <m:sty m:val="p"/>
+              </m:rPr>
+              <m:t>DAI</m:t>
+            </m:r>
+          </m:e>
+          <m:sub>
+            <m:r>
+              <m:t>z</m:t>
+            </m:r>
+          </m:sub>
+        </m:sSub>
+      </m:oMath>
+      <w:r>
+        <w:t xml:space="preserve">ᵢ) +</w:t>
+      </w:r>
+      <w:r>
+        <w:t xml:space="preserve"> </w:t>
+      </w:r>
+      <m:oMath>
+        <m:r>
+          <m:t>γ</m:t>
+        </m:r>
+      </m:oMath>
+      <w:r>
+        <w:t xml:space="preserve">·Xᵢ + δ_s +</w:t>
+      </w:r>
+      <w:r>
+        <w:t xml:space="preserve"> </w:t>
+      </w:r>
+      <m:oMath>
+        <m:r>
+          <m:t>ϵ</m:t>
+        </m:r>
+      </m:oMath>
+      <w:r>
+        <w:t xml:space="preserve">ᵢ</w:t>
       </w:r>
     </w:p>
     <w:p>
@@ -1784,13 +3477,421 @@
         <w:t xml:space="preserve"> </w:t>
       </w:r>
       <w:r>
-        <w:t xml:space="preserve">ln(LP)ᵢ = α + β₁ FSTS_cᵢ + β₂ FSTS_c²ᵢ + β₃ TCI_zᵢ + β₄ DAI_zᵢ + β₅(FSTS_cᵢ × DAI_zᵢ) + β₆(FSTS_c²ᵢ × DAI_zᵢ) + γ·Xᵢ + δ_s + εᵢ</w:t>
-      </w:r>
-      <w:r>
-        <w:t xml:space="preserve"> </w:t>
-      </w:r>
-      <w:r>
-        <w:t xml:space="preserve">[H3: β₆ &gt; 0 (p &lt; .01), amplification; confirmed: β₆ = +3.119, p = .005]</w:t>
+        <w:t xml:space="preserve">ln(LP)ᵢ =</w:t>
+      </w:r>
+      <w:r>
+        <w:t xml:space="preserve"> </w:t>
+      </w:r>
+      <m:oMath>
+        <m:r>
+          <m:t>α</m:t>
+        </m:r>
+      </m:oMath>
+      <w:r>
+        <w:t xml:space="preserve"> </w:t>
+      </w:r>
+      <w:r>
+        <w:t xml:space="preserve">+</w:t>
+      </w:r>
+      <w:r>
+        <w:t xml:space="preserve"> </w:t>
+      </w:r>
+      <m:oMath>
+        <m:sSub>
+          <m:e>
+            <m:r>
+              <m:t>β</m:t>
+            </m:r>
+          </m:e>
+          <m:sub>
+            <m:r>
+              <m:t>1</m:t>
+            </m:r>
+          </m:sub>
+        </m:sSub>
+      </m:oMath>
+      <w:r>
+        <w:t xml:space="preserve"> </w:t>
+      </w:r>
+      <m:oMath>
+        <m:sSub>
+          <m:e>
+            <m:r>
+              <m:rPr>
+                <m:nor/>
+                <m:sty m:val="p"/>
+              </m:rPr>
+              <m:t>FSTS</m:t>
+            </m:r>
+          </m:e>
+          <m:sub>
+            <m:r>
+              <m:t>c</m:t>
+            </m:r>
+          </m:sub>
+        </m:sSub>
+      </m:oMath>
+      <w:r>
+        <w:t xml:space="preserve">ᵢ +</w:t>
+      </w:r>
+      <w:r>
+        <w:t xml:space="preserve"> </w:t>
+      </w:r>
+      <m:oMath>
+        <m:sSub>
+          <m:e>
+            <m:r>
+              <m:t>β</m:t>
+            </m:r>
+          </m:e>
+          <m:sub>
+            <m:r>
+              <m:t>2</m:t>
+            </m:r>
+          </m:sub>
+        </m:sSub>
+      </m:oMath>
+      <w:r>
+        <w:t xml:space="preserve"> </w:t>
+      </w:r>
+      <m:oMath>
+        <m:sSubSup>
+          <m:e>
+            <m:r>
+              <m:rPr>
+                <m:nor/>
+                <m:sty m:val="p"/>
+              </m:rPr>
+              <m:t>FSTS</m:t>
+            </m:r>
+          </m:e>
+          <m:sub>
+            <m:r>
+              <m:t>c</m:t>
+            </m:r>
+          </m:sub>
+          <m:sup>
+            <m:r>
+              <m:t>2</m:t>
+            </m:r>
+          </m:sup>
+        </m:sSubSup>
+      </m:oMath>
+      <w:r>
+        <w:t xml:space="preserve">ᵢ +</w:t>
+      </w:r>
+      <w:r>
+        <w:t xml:space="preserve"> </w:t>
+      </w:r>
+      <m:oMath>
+        <m:sSub>
+          <m:e>
+            <m:r>
+              <m:t>β</m:t>
+            </m:r>
+          </m:e>
+          <m:sub>
+            <m:r>
+              <m:t>3</m:t>
+            </m:r>
+          </m:sub>
+        </m:sSub>
+      </m:oMath>
+      <w:r>
+        <w:t xml:space="preserve"> </w:t>
+      </w:r>
+      <m:oMath>
+        <m:sSub>
+          <m:e>
+            <m:r>
+              <m:rPr>
+                <m:nor/>
+                <m:sty m:val="p"/>
+              </m:rPr>
+              <m:t>TCI</m:t>
+            </m:r>
+          </m:e>
+          <m:sub>
+            <m:r>
+              <m:t>z</m:t>
+            </m:r>
+          </m:sub>
+        </m:sSub>
+      </m:oMath>
+      <w:r>
+        <w:t xml:space="preserve">ᵢ +</w:t>
+      </w:r>
+      <w:r>
+        <w:t xml:space="preserve"> </w:t>
+      </w:r>
+      <m:oMath>
+        <m:sSub>
+          <m:e>
+            <m:r>
+              <m:t>β</m:t>
+            </m:r>
+          </m:e>
+          <m:sub>
+            <m:r>
+              <m:t>4</m:t>
+            </m:r>
+          </m:sub>
+        </m:sSub>
+      </m:oMath>
+      <w:r>
+        <w:t xml:space="preserve"> </w:t>
+      </w:r>
+      <m:oMath>
+        <m:sSub>
+          <m:e>
+            <m:r>
+              <m:rPr>
+                <m:nor/>
+                <m:sty m:val="p"/>
+              </m:rPr>
+              <m:t>DAI</m:t>
+            </m:r>
+          </m:e>
+          <m:sub>
+            <m:r>
+              <m:t>z</m:t>
+            </m:r>
+          </m:sub>
+        </m:sSub>
+      </m:oMath>
+      <w:r>
+        <w:t xml:space="preserve">ᵢ +</w:t>
+      </w:r>
+      <w:r>
+        <w:t xml:space="preserve"> </w:t>
+      </w:r>
+      <m:oMath>
+        <m:sSub>
+          <m:e>
+            <m:r>
+              <m:t>β</m:t>
+            </m:r>
+          </m:e>
+          <m:sub>
+            <m:r>
+              <m:t>5</m:t>
+            </m:r>
+          </m:sub>
+        </m:sSub>
+      </m:oMath>
+      <w:r>
+        <w:t xml:space="preserve">(</w:t>
+      </w:r>
+      <m:oMath>
+        <m:sSub>
+          <m:e>
+            <m:r>
+              <m:rPr>
+                <m:nor/>
+                <m:sty m:val="p"/>
+              </m:rPr>
+              <m:t>FSTS</m:t>
+            </m:r>
+          </m:e>
+          <m:sub>
+            <m:r>
+              <m:t>c</m:t>
+            </m:r>
+          </m:sub>
+        </m:sSub>
+      </m:oMath>
+      <w:r>
+        <w:t xml:space="preserve">ᵢ</w:t>
+      </w:r>
+      <w:r>
+        <w:t xml:space="preserve"> </w:t>
+      </w:r>
+      <m:oMath>
+        <m:r>
+          <m:rPr>
+            <m:sty m:val="p"/>
+          </m:rPr>
+          <m:t>×</m:t>
+        </m:r>
+      </m:oMath>
+      <w:r>
+        <w:t xml:space="preserve"> </w:t>
+      </w:r>
+      <m:oMath>
+        <m:sSub>
+          <m:e>
+            <m:r>
+              <m:rPr>
+                <m:nor/>
+                <m:sty m:val="p"/>
+              </m:rPr>
+              <m:t>DAI</m:t>
+            </m:r>
+          </m:e>
+          <m:sub>
+            <m:r>
+              <m:t>z</m:t>
+            </m:r>
+          </m:sub>
+        </m:sSub>
+      </m:oMath>
+      <w:r>
+        <w:t xml:space="preserve">ᵢ) +</w:t>
+      </w:r>
+      <w:r>
+        <w:t xml:space="preserve"> </w:t>
+      </w:r>
+      <m:oMath>
+        <m:sSub>
+          <m:e>
+            <m:r>
+              <m:t>β</m:t>
+            </m:r>
+          </m:e>
+          <m:sub>
+            <m:r>
+              <m:t>6</m:t>
+            </m:r>
+          </m:sub>
+        </m:sSub>
+      </m:oMath>
+      <w:r>
+        <w:t xml:space="preserve">(</w:t>
+      </w:r>
+      <m:oMath>
+        <m:sSubSup>
+          <m:e>
+            <m:r>
+              <m:rPr>
+                <m:nor/>
+                <m:sty m:val="p"/>
+              </m:rPr>
+              <m:t>FSTS</m:t>
+            </m:r>
+          </m:e>
+          <m:sub>
+            <m:r>
+              <m:t>c</m:t>
+            </m:r>
+          </m:sub>
+          <m:sup>
+            <m:r>
+              <m:t>2</m:t>
+            </m:r>
+          </m:sup>
+        </m:sSubSup>
+      </m:oMath>
+      <w:r>
+        <w:t xml:space="preserve">ᵢ</w:t>
+      </w:r>
+      <w:r>
+        <w:t xml:space="preserve"> </w:t>
+      </w:r>
+      <m:oMath>
+        <m:r>
+          <m:rPr>
+            <m:sty m:val="p"/>
+          </m:rPr>
+          <m:t>×</m:t>
+        </m:r>
+      </m:oMath>
+      <w:r>
+        <w:t xml:space="preserve"> </w:t>
+      </w:r>
+      <m:oMath>
+        <m:sSub>
+          <m:e>
+            <m:r>
+              <m:rPr>
+                <m:nor/>
+                <m:sty m:val="p"/>
+              </m:rPr>
+              <m:t>DAI</m:t>
+            </m:r>
+          </m:e>
+          <m:sub>
+            <m:r>
+              <m:t>z</m:t>
+            </m:r>
+          </m:sub>
+        </m:sSub>
+      </m:oMath>
+      <w:r>
+        <w:t xml:space="preserve">ᵢ) +</w:t>
+      </w:r>
+      <w:r>
+        <w:t xml:space="preserve"> </w:t>
+      </w:r>
+      <m:oMath>
+        <m:r>
+          <m:t>γ</m:t>
+        </m:r>
+      </m:oMath>
+      <w:r>
+        <w:t xml:space="preserve">·Xᵢ + δ_s +</w:t>
+      </w:r>
+      <w:r>
+        <w:t xml:space="preserve"> </w:t>
+      </w:r>
+      <m:oMath>
+        <m:r>
+          <m:t>ϵ</m:t>
+        </m:r>
+      </m:oMath>
+      <w:r>
+        <w:t xml:space="preserve">ᵢ</w:t>
+      </w:r>
+      <w:r>
+        <w:t xml:space="preserve"> </w:t>
+      </w:r>
+      <w:r>
+        <w:t xml:space="preserve">[H3:</w:t>
+      </w:r>
+      <w:r>
+        <w:t xml:space="preserve"> </w:t>
+      </w:r>
+      <m:oMath>
+        <m:sSub>
+          <m:e>
+            <m:r>
+              <m:t>β</m:t>
+            </m:r>
+          </m:e>
+          <m:sub>
+            <m:r>
+              <m:t>6</m:t>
+            </m:r>
+          </m:sub>
+        </m:sSub>
+      </m:oMath>
+      <w:r>
+        <w:t xml:space="preserve"> </w:t>
+      </w:r>
+      <w:r>
+        <w:t xml:space="preserve">&gt; 0 (p &lt; .01), amplification; confirmed:</w:t>
+      </w:r>
+      <w:r>
+        <w:t xml:space="preserve"> </w:t>
+      </w:r>
+      <m:oMath>
+        <m:sSub>
+          <m:e>
+            <m:r>
+              <m:t>β</m:t>
+            </m:r>
+          </m:e>
+          <m:sub>
+            <m:r>
+              <m:t>6</m:t>
+            </m:r>
+          </m:sub>
+        </m:sSub>
+      </m:oMath>
+      <w:r>
+        <w:t xml:space="preserve"> </w:t>
+      </w:r>
+      <w:r>
+        <w:t xml:space="preserve">= +3.119, p = .005]</w:t>
       </w:r>
     </w:p>
     <w:p>
@@ -1806,7 +3907,57 @@
         <w:pStyle w:val="BodyText"/>
       </w:pPr>
       <w:r>
-        <w:t xml:space="preserve">The full model includes centred FSTS, squared centred FSTS, TCI, DAI, the interaction between FSTS and DAI, and the quadratic interaction between FSTS² and DAI, in addition to the control set. A supplementary specification replaces the DAI interaction block with analogous TCI interaction terms in order to assess whether any TCI moderation is empirically detectable beyond its more stable direct association with productivity. Following the recommendations of Haans et al. (2016) for testing curvilinear relationships in strategy research, the study applies the Lind and Mehlum (2010) test for a U-shaped or inverted-U relationship to assess the quadratic shape formally. To assess whether the DAI interaction block matters jointly, the study reports a joint F-test on the two DAI interaction terms and also interprets effect size using Cohen’s f² (Aguinis et al. 2005; Cohen 1988).</w:t>
+        <w:t xml:space="preserve">The full model includes centred FSTS, squared centred FSTS, TCI, DAI, the interaction between FSTS and DAI, and the quadratic interaction between</w:t>
+      </w:r>
+      <w:r>
+        <w:t xml:space="preserve"> </w:t>
+      </w:r>
+      <m:oMath>
+        <m:sSup>
+          <m:e>
+            <m:r>
+              <m:rPr>
+                <m:nor/>
+                <m:sty m:val="p"/>
+              </m:rPr>
+              <m:t>FSTS</m:t>
+            </m:r>
+          </m:e>
+          <m:sup>
+            <m:r>
+              <m:t>2</m:t>
+            </m:r>
+          </m:sup>
+        </m:sSup>
+      </m:oMath>
+      <w:r>
+        <w:t xml:space="preserve"> </w:t>
+      </w:r>
+      <w:r>
+        <w:t xml:space="preserve">and DAI, in addition to the control set. A supplementary specification replaces the DAI interaction block with analogous TCI interaction terms in order to assess whether any TCI moderation is empirically detectable beyond its more stable direct association with productivity. Following the recommendations of Haans et al. (2016) for testing curvilinear relationships in strategy research, the study applies the Lind and Mehlum (2010) test for a U-shaped or inverted-U relationship to assess the quadratic shape formally. To assess whether the DAI interaction block matters jointly, the study reports a joint F-test on the two DAI interaction terms and also interprets effect size using Cohen’s</w:t>
+      </w:r>
+      <w:r>
+        <w:t xml:space="preserve"> </w:t>
+      </w:r>
+      <m:oMath>
+        <m:sSup>
+          <m:e>
+            <m:r>
+              <m:t>f</m:t>
+            </m:r>
+          </m:e>
+          <m:sup>
+            <m:r>
+              <m:t>2</m:t>
+            </m:r>
+          </m:sup>
+        </m:sSup>
+      </m:oMath>
+      <w:r>
+        <w:t xml:space="preserve"> </w:t>
+      </w:r>
+      <w:r>
+        <w:t xml:space="preserve">(Aguinis et al. 2005; Cohen 1988).</w:t>
       </w:r>
     </w:p>
     <w:p>
@@ -1876,7 +4027,24 @@
         <w:t xml:space="preserve"> </w:t>
       </w:r>
       <w:r>
-        <w:t xml:space="preserve">The analytic sample (N = 623 full, 617 with all controls) is representative of Singapore’s SME sector under the WBES sampling frame. Within this frame, 82 % of firms report zero exports, only 18 % report any positive export intensity, and only 3 % exceed 50 % FSTS. The implication for inference is that the curvature parameters in the quadratic FSTS specification are identified primarily through the participation contrast between FSTS = 0 and FSTS &gt; 0, with limited support in the upper tail of export intensity. The fitted turning point near FSTS ≈ 82 % falls in a sparsely populated region of the data, and the 95 % bootstrap confidence interval is wide ([53 %, 253 %]) even though an inverted-U shape is recovered in 96.3 % of resamples. The wide confidence interval [53%, 253%] reflects sparse upper-tail support (only 3% of firms exceed 50% FSTS); this is a support-constrained estimate and should be interpreted as indicating saturation rather than as a precise threshold value. The conventional inverted-U interpretation is therefore not formally identified within the supported data range, and the Section 4 results are interpreted under this support-aware framing.</w:t>
+        <w:t xml:space="preserve">The analytic sample (N = 623 full, 617 with all controls) is representative of Singapore’s SME sector under the WBES sampling frame. Within this frame, 82 % of firms report zero exports, only 18 % report any positive export intensity, and only 3 % exceed 50 % FSTS. The implication for inference is that the curvature parameters in the quadratic FSTS specification are identified primarily through the participation contrast between FSTS = 0 and FSTS &gt; 0, with limited support in the upper tail of export intensity. The fitted turning point near FSTS</w:t>
+      </w:r>
+      <w:r>
+        <w:t xml:space="preserve"> </w:t>
+      </w:r>
+      <m:oMath>
+        <m:r>
+          <m:rPr>
+            <m:sty m:val="p"/>
+          </m:rPr>
+          <m:t>≈</m:t>
+        </m:r>
+      </m:oMath>
+      <w:r>
+        <w:t xml:space="preserve"> </w:t>
+      </w:r>
+      <w:r>
+        <w:t xml:space="preserve">82 % falls in a sparsely populated region of the data, and the 95 % bootstrap confidence interval is wide ([53 %, 253 %]) even though an inverted-U shape is recovered in 96.3 % of resamples. The wide confidence interval [53%, 253%] reflects sparse upper-tail support (only 3% of firms exceed 50% FSTS); this is a support-constrained estimate and should be interpreted as indicating saturation rather than as a precise threshold value. The conventional inverted-U interpretation is therefore not formally identified within the supported data range, and the Section 4 results are interpreted under this support-aware framing.</w:t>
       </w:r>
     </w:p>
     <w:p>
@@ -1894,7 +4062,52 @@
         <w:t xml:space="preserve"> </w:t>
       </w:r>
       <w:r>
-        <w:t xml:space="preserve">The exporters-only subsample (FSTS &gt; 0, N = 84) is the natural setting in which to read the intensity-margin coordination-cost mechanism, but is substantially underpowered for detecting the small effect-size moderation block (f² ≈ 0.018). At α = .05 with one numerator degree of freedom, achieving 80 % power requires N ≳ 430; power at N = 84 is approximately 16 %. Three inferential bounds therefore apply: (a)</w:t>
+        <w:t xml:space="preserve">The exporters-only subsample (FSTS &gt; 0, N = 84) is the natural setting in which to read the intensity-margin coordination-cost mechanism, but is substantially underpowered for detecting the small effect-size moderation block (</w:t>
+      </w:r>
+      <m:oMath>
+        <m:sSup>
+          <m:e>
+            <m:r>
+              <m:t>f</m:t>
+            </m:r>
+          </m:e>
+          <m:sup>
+            <m:r>
+              <m:t>2</m:t>
+            </m:r>
+          </m:sup>
+        </m:sSup>
+      </m:oMath>
+      <w:r>
+        <w:t xml:space="preserve"> </w:t>
+      </w:r>
+      <m:oMath>
+        <m:r>
+          <m:rPr>
+            <m:sty m:val="p"/>
+          </m:rPr>
+          <m:t>≈</m:t>
+        </m:r>
+      </m:oMath>
+      <w:r>
+        <w:t xml:space="preserve"> </w:t>
+      </w:r>
+      <w:r>
+        <w:t xml:space="preserve">0.018). At</w:t>
+      </w:r>
+      <w:r>
+        <w:t xml:space="preserve"> </w:t>
+      </w:r>
+      <m:oMath>
+        <m:r>
+          <m:t>α</m:t>
+        </m:r>
+      </m:oMath>
+      <w:r>
+        <w:t xml:space="preserve"> </w:t>
+      </w:r>
+      <w:r>
+        <w:t xml:space="preserve">= .05 with one numerator degree of freedom, achieving 80 % power requires N ≳ 430; power at N = 84 is approximately 16 %. Three inferential bounds therefore apply: (a)</w:t>
       </w:r>
       <w:r>
         <w:t xml:space="preserve"> </w:t>
@@ -1907,7 +4120,38 @@
         <w:t xml:space="preserve">What cannot be concluded</w:t>
       </w:r>
       <w:r>
-        <w:t xml:space="preserve">: the intensity-margin DAI mechanism cannot be confirmed in the exporter-only subsample (N = 84, power ≈ 16%), we are underpowered to detect interaction effects of β &lt; 1.5 standard deviations; (b)</w:t>
+        <w:t xml:space="preserve">: the intensity-margin DAI mechanism cannot be confirmed in the exporter-only subsample (N = 84, power</w:t>
+      </w:r>
+      <w:r>
+        <w:t xml:space="preserve"> </w:t>
+      </w:r>
+      <m:oMath>
+        <m:r>
+          <m:rPr>
+            <m:sty m:val="p"/>
+          </m:rPr>
+          <m:t>≈</m:t>
+        </m:r>
+      </m:oMath>
+      <w:r>
+        <w:t xml:space="preserve"> </w:t>
+      </w:r>
+      <w:r>
+        <w:t xml:space="preserve">16%), we are underpowered to detect interaction effects of</w:t>
+      </w:r>
+      <w:r>
+        <w:t xml:space="preserve"> </w:t>
+      </w:r>
+      <m:oMath>
+        <m:r>
+          <m:t>β</m:t>
+        </m:r>
+      </m:oMath>
+      <w:r>
+        <w:t xml:space="preserve"> </w:t>
+      </w:r>
+      <w:r>
+        <w:t xml:space="preserve">&lt; 1.5 standard deviations; (b)</w:t>
       </w:r>
       <w:r>
         <w:t xml:space="preserve"> </w:t>
@@ -1920,7 +4164,38 @@
         <w:t xml:space="preserve">Methodological remedy</w:t>
       </w:r>
       <w:r>
-        <w:t xml:space="preserve">: panel data or an exporter oversampling design with N ≥ 300 would enable intensity-margin inference; (c) power requirements for interaction testing follow Leon (2004). Null DAI moderation results in the exporters-only specification therefore should not be interpreted as evidence against the conditional-scaling mechanism; conversely, the positive joint F-test reported in the R5 exporters-only specification (F = 6.32, p = .003, β = +2.821) is a stronger positive signal than the marginal sample size would ordinarily support, and is read here as a high-prior-strength signal consistent with the full-sample amplification mechanism rather than as a stand-alone identifying test.</w:t>
+        <w:t xml:space="preserve">: panel data or an exporter oversampling design with N</w:t>
+      </w:r>
+      <w:r>
+        <w:t xml:space="preserve"> </w:t>
+      </w:r>
+      <m:oMath>
+        <m:r>
+          <m:rPr>
+            <m:sty m:val="p"/>
+          </m:rPr>
+          <m:t>≥</m:t>
+        </m:r>
+      </m:oMath>
+      <w:r>
+        <w:t xml:space="preserve"> </w:t>
+      </w:r>
+      <w:r>
+        <w:t xml:space="preserve">300 would enable intensity-margin inference; (c) power requirements for interaction testing follow Leon (2004). Null DAI moderation results in the exporters-only specification therefore should not be interpreted as evidence against the conditional-scaling mechanism; conversely, the positive joint F-test reported in the R5 exporters-only specification (F = 6.32, p = .003,</w:t>
+      </w:r>
+      <w:r>
+        <w:t xml:space="preserve"> </w:t>
+      </w:r>
+      <m:oMath>
+        <m:r>
+          <m:t>β</m:t>
+        </m:r>
+      </m:oMath>
+      <w:r>
+        <w:t xml:space="preserve"> </w:t>
+      </w:r>
+      <w:r>
+        <w:t xml:space="preserve">= +2.821) is a stronger positive signal than the marginal sample size would ordinarily support, and is read here as a high-prior-strength signal consistent with the full-sample amplification mechanism rather than as a stand-alone identifying test.</w:t>
       </w:r>
     </w:p>
     <w:p>
@@ -2019,7 +4294,66 @@
         <w:t xml:space="preserve"> </w:t>
       </w:r>
       <w:r>
-        <w:t xml:space="preserve">No instrument satisfying the exclusion restriction for export participation is available in the single-wave WBES Singapore design. A reduced-form sensitivity check estimates a first-stage probit of export participation on observable firm characteristics (age, log size, sector fixed effects, WBES sampling stratum) and adds the resulting inverse Mills ratio (IMR) as a covariate to the M8 specification. The IMR coefficient (β = 0.264, SE = 0.138, t = 1.92, p = .055) is just above the .05 threshold, indicating mild selection at the extensive margin of export participation. The key DAI × FSTS² interaction (H3 amplification) and the TCI coefficient are not materially altered (|Δ| &lt; 0.02 in each case), confirming that the conditional-scaling mechanism is robust to this selection adjustment. Consistent with Wolfolds and Siegel (2019), the OLS estimates are reported as the primary specification with the caveat that selection on unobservables cannot be fully excluded from the single-wave cross-sectional design.</w:t>
+        <w:t xml:space="preserve">No instrument satisfying the exclusion restriction for export participation is available in the single-wave WBES Singapore design. A reduced-form sensitivity check estimates a first-stage probit of export participation on observable firm characteristics (age, log size, sector fixed effects, WBES sampling stratum) and adds the resulting inverse Mills ratio (IMR) as a covariate to the M8 specification. The IMR coefficient (</w:t>
+      </w:r>
+      <m:oMath>
+        <m:r>
+          <m:t>β</m:t>
+        </m:r>
+      </m:oMath>
+      <w:r>
+        <w:t xml:space="preserve"> </w:t>
+      </w:r>
+      <w:r>
+        <w:t xml:space="preserve">= 0.264, SE = 0.138, t = 1.92, p = .055) is just above the .05 threshold, indicating mild selection at the extensive margin of export participation. The key</w:t>
+      </w:r>
+      <w:r>
+        <w:t xml:space="preserve"> </w:t>
+      </w:r>
+      <m:oMath>
+        <m:r>
+          <m:rPr>
+            <m:nor/>
+            <m:sty m:val="p"/>
+          </m:rPr>
+          <m:t>DAI</m:t>
+        </m:r>
+        <m:r>
+          <m:rPr>
+            <m:sty m:val="p"/>
+          </m:rPr>
+          <m:t>×</m:t>
+        </m:r>
+        <m:sSup>
+          <m:e>
+            <m:r>
+              <m:rPr>
+                <m:nor/>
+                <m:sty m:val="p"/>
+              </m:rPr>
+              <m:t>FSTS</m:t>
+            </m:r>
+          </m:e>
+          <m:sup>
+            <m:r>
+              <m:t>2</m:t>
+            </m:r>
+          </m:sup>
+        </m:sSup>
+      </m:oMath>
+      <w:r>
+        <w:t xml:space="preserve"> </w:t>
+      </w:r>
+      <w:r>
+        <w:t xml:space="preserve">interaction (H3 amplification) and the TCI coefficient are not materially altered (|</w:t>
+      </w:r>
+      <m:oMath>
+        <m:r>
+          <m:t>Δ</m:t>
+        </m:r>
+      </m:oMath>
+      <w:r>
+        <w:t xml:space="preserve">| &lt; 0.02 in each case), confirming that the conditional-scaling mechanism is robust to this selection adjustment. Consistent with Wolfolds and Siegel (2019), the OLS estimates are reported as the primary specification with the caveat that selection on unobservables cannot be fully excluded from the single-wave cross-sectional design.</w:t>
       </w:r>
     </w:p>
     <w:p>
@@ -2361,7 +4695,29 @@
         <w:t xml:space="preserve"> </w:t>
       </w:r>
       <w:r>
-        <w:t xml:space="preserve">In the baseline quadratic specification (Model M2), the linear FSTS term is positive and statistically significant (β = +2.652, SE = 0.691, p &lt; .001), whereas the squared term is negative (β = −1.705, SE = 0.931, p = .068). The fitted curve therefore implies a turning point in the upper tail of the export-intensity distribution, near FSTS = 82% on the original scale, but that point is imprecisely located and falls in a sparsely populated region of the data. The 5,000-replication bootstrap recovers an inverted-U shape frequently (96.3% of replications), yet the corresponding 95% percentile confidence interval for the turning point is wide ([53%, 253%]), and the Lind–Mehlum test does not formally confirm a conventional inverted-U at conventional significance levels (p = .303). This null is itself an informative positive result: Singapore’s DAI distribution is concentrated at the high end, where approximately 67% of firms report website presence and Tier 2 e-payment adoption is widespread, leaving insufficient distributional spread to formally identify the right-side decline within the observable FSTS range. In a digitally mature economy where Tier 1–2 coordination tools are widely diffused, the attenuation of the classic coordination-cost mechanism is consistent with the saturation hypothesis underlying H3 rather than constituting a failure of the inverted-U framework. The interpretive force of this null is sharpened by an equivalence-test framing (Lakens, Scheel, &amp; Isager, 2018): with the observed FSTS range bounded essentially at the 70th percentile of the distribution, the L–M test is statistically underpowered to distinguish</w:t>
+        <w:t xml:space="preserve">In the baseline quadratic specification (Model M2), the linear FSTS term is positive and statistically significant (</w:t>
+      </w:r>
+      <m:oMath>
+        <m:r>
+          <m:t>β</m:t>
+        </m:r>
+      </m:oMath>
+      <w:r>
+        <w:t xml:space="preserve"> </w:t>
+      </w:r>
+      <w:r>
+        <w:t xml:space="preserve">= +2.652, SE = 0.691, p &lt; .001), whereas the squared term is negative (</w:t>
+      </w:r>
+      <m:oMath>
+        <m:r>
+          <m:t>β</m:t>
+        </m:r>
+      </m:oMath>
+      <w:r>
+        <w:t xml:space="preserve"> </w:t>
+      </w:r>
+      <w:r>
+        <w:t xml:space="preserve">= −1.705, SE = 0.931, p = .068). The fitted curve therefore implies a turning point in the upper tail of the export-intensity distribution, near FSTS = 82% on the original scale, but that point is imprecisely located and falls in a sparsely populated region of the data. The 5,000-replication bootstrap recovers an inverted-U shape frequently (96.3% of replications), yet the corresponding 95% percentile confidence interval for the turning point is wide ([53%, 253%]), and the Lind–Mehlum test does not formally confirm a conventional inverted-U at conventional significance levels (p = .303). This null is itself an informative positive result: Singapore’s DAI distribution is concentrated at the high end, where approximately 67% of firms report website presence and Tier 2 e-payment adoption is widespread, leaving insufficient distributional spread to formally identify the right-side decline within the observable FSTS range. In a digitally mature economy where Tier 1–2 coordination tools are widely diffused, the attenuation of the classic coordination-cost mechanism is consistent with the saturation hypothesis underlying H3 rather than constituting a failure of the inverted-U framework. The interpretive force of this null is sharpened by an equivalence-test framing (Lakens, Scheel, &amp; Isager, 2018): with the observed FSTS range bounded essentially at the 70th percentile of the distribution, the L–M test is statistically underpowered to distinguish</w:t>
       </w:r>
       <w:r>
         <w:t xml:space="preserve"> </w:t>
@@ -2428,13 +4784,58 @@
         <w:pStyle w:val="FirstParagraph"/>
       </w:pPr>
       <w:r>
-        <w:t xml:space="preserve">The direct-effect model for technological capability (Model M5) indicates that TCI is positively associated with labour productivity (β = 0.168, SE = 0.040, p &lt; .001). Model fit also improves relative to the quadratic baseline, with R² rising from 0.178 in Model M2 to 0.199 in Model M5. This pattern supports the view that technological capability raises the firm’s productivity base rather than simply proxying for export intensity.</w:t>
-      </w:r>
-      <w:r>
-        <w:t xml:space="preserve"> </w:t>
-      </w:r>
-      <w:r>
-        <w:t xml:space="preserve">In the supplementary TCI-moderation specification (Model M3), the direct TCI coefficient remains positive and significant (β = 0.188, p &lt; .001), but the interaction terms involving FSTS and squared FSTS are jointly insignificant. Because the absence of moderation cannot be inferred from non-significance alone, the evidence is better read as supporting an intercept-dominant interpretation of the TCI association rather than as a definitive demonstration that curvature moderation is exactly zero. Taken together, the evidence is more consistent with an intercept-dominant reading of the TCI association than with a clearly identified moderation channel in the internationalization–performance relationship. This is also the most coherent reading for hypothesis development, because it preserves the distinction between internal capability depth and export-contingent digital complementarity.</w:t>
+        <w:t xml:space="preserve">The direct-effect model for technological capability (Model M5) indicates that TCI is positively associated with labour productivity (</w:t>
+      </w:r>
+      <m:oMath>
+        <m:r>
+          <m:t>β</m:t>
+        </m:r>
+      </m:oMath>
+      <w:r>
+        <w:t xml:space="preserve"> </w:t>
+      </w:r>
+      <w:r>
+        <w:t xml:space="preserve">= 0.168, SE = 0.040, p &lt; .001). Model fit also improves relative to the quadratic baseline, with</w:t>
+      </w:r>
+      <w:r>
+        <w:t xml:space="preserve"> </w:t>
+      </w:r>
+      <m:oMath>
+        <m:sSup>
+          <m:e>
+            <m:r>
+              <m:t>R</m:t>
+            </m:r>
+          </m:e>
+          <m:sup>
+            <m:r>
+              <m:t>2</m:t>
+            </m:r>
+          </m:sup>
+        </m:sSup>
+      </m:oMath>
+      <w:r>
+        <w:t xml:space="preserve"> </w:t>
+      </w:r>
+      <w:r>
+        <w:t xml:space="preserve">rising from 0.178 in Model M2 to 0.199 in Model M5. This pattern supports the view that technological capability raises the firm’s productivity base rather than simply proxying for export intensity.</w:t>
+      </w:r>
+      <w:r>
+        <w:t xml:space="preserve"> </w:t>
+      </w:r>
+      <w:r>
+        <w:t xml:space="preserve">In the supplementary TCI-moderation specification (Model M3), the direct TCI coefficient remains positive and significant (</w:t>
+      </w:r>
+      <m:oMath>
+        <m:r>
+          <m:t>β</m:t>
+        </m:r>
+      </m:oMath>
+      <w:r>
+        <w:t xml:space="preserve"> </w:t>
+      </w:r>
+      <w:r>
+        <w:t xml:space="preserve">= 0.188, p &lt; .001), but the interaction terms involving FSTS and squared FSTS are jointly insignificant. Because the absence of moderation cannot be inferred from non-significance alone, the evidence is better read as supporting an intercept-dominant interpretation of the TCI association rather than as a definitive demonstration that curvature moderation is exactly zero. Taken together, the evidence is more consistent with an intercept-dominant reading of the TCI association than with a clearly identified moderation channel in the internationalization–performance relationship. This is also the most coherent reading for hypothesis development, because it preserves the distinction between internal capability depth and export-contingent digital complementarity.</w:t>
       </w:r>
       <w:r>
         <w:t xml:space="preserve"> </w:t>
@@ -2446,7 +4847,32 @@
         <w:t xml:space="preserve"> </w:t>
       </w:r>
       <w:r>
-        <w:t xml:space="preserve">In the direct-effect model for digital adoption (Model M6), DAI is positively associated with labour productivity (β = 0.104, SE = 0.038, p = .007). However, once TCI is included alongside DAI in Model M7, the DAI coefficient attenuates to β = 0.077 and remains statistically significant but attenuated (p = .048), suggesting partial overlap in the average-firm heterogeneity captured by the two constructs. This attenuation is substantively important because it suggests that DAI should not be interpreted as a large, uniform productivity premium across sampled firms.</w:t>
+        <w:t xml:space="preserve">In the direct-effect model for digital adoption (Model M6), DAI is positively associated with labour productivity (</w:t>
+      </w:r>
+      <m:oMath>
+        <m:r>
+          <m:t>β</m:t>
+        </m:r>
+      </m:oMath>
+      <w:r>
+        <w:t xml:space="preserve"> </w:t>
+      </w:r>
+      <w:r>
+        <w:t xml:space="preserve">= 0.104, SE = 0.038, p = .007). However, once TCI is included alongside DAI in Model M7, the DAI coefficient attenuates to</w:t>
+      </w:r>
+      <w:r>
+        <w:t xml:space="preserve"> </w:t>
+      </w:r>
+      <m:oMath>
+        <m:r>
+          <m:t>β</m:t>
+        </m:r>
+      </m:oMath>
+      <w:r>
+        <w:t xml:space="preserve"> </w:t>
+      </w:r>
+      <w:r>
+        <w:t xml:space="preserve">= 0.077 and remains statistically significant but attenuated (p = .048), suggesting partial overlap in the average-firm heterogeneity captured by the two constructs. This attenuation is substantively important because it suggests that DAI should not be interpreted as a large, uniform productivity premium across sampled firms.</w:t>
       </w:r>
       <w:r>
         <w:t xml:space="preserve"> </w:t>
@@ -4381,7 +6807,86 @@
         <w:t xml:space="preserve"> </w:t>
       </w:r>
       <w:r>
-        <w:t xml:space="preserve">The strongest evidence for DAI appears in the moderation specifications. In the full model (Model M8), the direct DAI term is small and not statistically significant (β = 0.019, p = .705), the linear interaction with FSTS is negative but does not reach conventional significance (β = −1.177, p = .083), and the quadratic interaction term is positive and statistically significant (β = 3.119, SE = 1.124, p = .005). Model M8 also produces the highest explanatory power among the main specifications, with R² = 0.211 and adjusted R² = 0.196. Read substantively, these estimates indicate that the productivity relevance of digital adoption becomes more positive at higher levels of export intensity, with the clearest signal concentrated in the high-export tail rather than distributed uniformly across the sample.</w:t>
+        <w:t xml:space="preserve">The strongest evidence for DAI appears in the moderation specifications. In the full model (Model M8), the direct DAI term is small and not statistically significant (</w:t>
+      </w:r>
+      <m:oMath>
+        <m:r>
+          <m:t>β</m:t>
+        </m:r>
+      </m:oMath>
+      <w:r>
+        <w:t xml:space="preserve"> </w:t>
+      </w:r>
+      <w:r>
+        <w:t xml:space="preserve">= 0.019, p = .705), the linear interaction with FSTS is negative but does not reach conventional significance (</w:t>
+      </w:r>
+      <m:oMath>
+        <m:r>
+          <m:t>β</m:t>
+        </m:r>
+      </m:oMath>
+      <w:r>
+        <w:t xml:space="preserve"> </w:t>
+      </w:r>
+      <w:r>
+        <w:t xml:space="preserve">= −1.177, p = .083), and the quadratic interaction term is positive and statistically significant (</w:t>
+      </w:r>
+      <m:oMath>
+        <m:r>
+          <m:t>β</m:t>
+        </m:r>
+      </m:oMath>
+      <w:r>
+        <w:t xml:space="preserve"> </w:t>
+      </w:r>
+      <w:r>
+        <w:t xml:space="preserve">= 3.119, SE = 1.124, p = .005). Model M8 also produces the highest explanatory power among the main specifications, with</w:t>
+      </w:r>
+      <w:r>
+        <w:t xml:space="preserve"> </w:t>
+      </w:r>
+      <m:oMath>
+        <m:sSup>
+          <m:e>
+            <m:r>
+              <m:t>R</m:t>
+            </m:r>
+          </m:e>
+          <m:sup>
+            <m:r>
+              <m:t>2</m:t>
+            </m:r>
+          </m:sup>
+        </m:sSup>
+      </m:oMath>
+      <w:r>
+        <w:t xml:space="preserve"> </w:t>
+      </w:r>
+      <w:r>
+        <w:t xml:space="preserve">= 0.211 and adjusted</w:t>
+      </w:r>
+      <w:r>
+        <w:t xml:space="preserve"> </w:t>
+      </w:r>
+      <m:oMath>
+        <m:sSup>
+          <m:e>
+            <m:r>
+              <m:t>R</m:t>
+            </m:r>
+          </m:e>
+          <m:sup>
+            <m:r>
+              <m:t>2</m:t>
+            </m:r>
+          </m:sup>
+        </m:sSup>
+      </m:oMath>
+      <w:r>
+        <w:t xml:space="preserve"> </w:t>
+      </w:r>
+      <w:r>
+        <w:t xml:space="preserve">= 0.196. Read substantively, these estimates indicate that the productivity relevance of digital adoption becomes more positive at higher levels of export intensity, with the clearest signal concentrated in the high-export tail rather than distributed uniformly across the sample.</w:t>
       </w:r>
       <w:r>
         <w:t xml:space="preserve"> </w:t>
@@ -5177,7 +7682,78 @@
         <w:t xml:space="preserve"> </w:t>
       </w:r>
       <w:r>
-        <w:t xml:space="preserve">Predicted internationalization–performance curve. Predicted relationship between export intensity and labour productivity with 95% confidence bands from the canonical quadratic specification (M2). The implied turning point occurs near FSTS = 82% on the original scale (−β₁/2β₂ on mean-centered FSTS ≈ 77.8%; adding back the sample mean of 0.045 gives ≈ 82%, Aiken &amp; West, 1991), but its 95% percentile cluster-bootstrap confidence interval (5,000 replications) spans [53%, 253%] (median 80%, IQR [68%, 102%]); the inverted-U shape is recovered in 96.3% of bootstrap replications, but its precise location is only loosely identified. The shaded red vertical band marks the bootstrap CI for the turning point. The estimate should therefore be interpreted as descriptive of the data rather than as structurally identified evidence of an inverted-U.</w:t>
+        <w:t xml:space="preserve">Predicted internationalization–performance curve. Predicted relationship between export intensity and labour productivity with 95% confidence bands from the canonical quadratic specification (M2). The implied turning point occurs near FSTS = 82% on the original scale (−</w:t>
+      </w:r>
+      <m:oMath>
+        <m:sSub>
+          <m:e>
+            <m:r>
+              <m:t>β</m:t>
+            </m:r>
+          </m:e>
+          <m:sub>
+            <m:r>
+              <m:t>1</m:t>
+            </m:r>
+          </m:sub>
+        </m:sSub>
+      </m:oMath>
+      <w:r>
+        <w:t xml:space="preserve">/2</w:t>
+      </w:r>
+      <m:oMath>
+        <m:sSub>
+          <m:e>
+            <m:r>
+              <m:t>β</m:t>
+            </m:r>
+          </m:e>
+          <m:sub>
+            <m:r>
+              <m:t>2</m:t>
+            </m:r>
+          </m:sub>
+        </m:sSub>
+      </m:oMath>
+      <w:r>
+        <w:t xml:space="preserve"> </w:t>
+      </w:r>
+      <w:r>
+        <w:t xml:space="preserve">on mean-centered FSTS</w:t>
+      </w:r>
+      <w:r>
+        <w:t xml:space="preserve"> </w:t>
+      </w:r>
+      <m:oMath>
+        <m:r>
+          <m:rPr>
+            <m:sty m:val="p"/>
+          </m:rPr>
+          <m:t>≈</m:t>
+        </m:r>
+      </m:oMath>
+      <w:r>
+        <w:t xml:space="preserve"> </w:t>
+      </w:r>
+      <w:r>
+        <w:t xml:space="preserve">77.8%; adding back the sample mean of 0.045 gives</w:t>
+      </w:r>
+      <w:r>
+        <w:t xml:space="preserve"> </w:t>
+      </w:r>
+      <m:oMath>
+        <m:r>
+          <m:rPr>
+            <m:sty m:val="p"/>
+          </m:rPr>
+          <m:t>≈</m:t>
+        </m:r>
+      </m:oMath>
+      <w:r>
+        <w:t xml:space="preserve"> </w:t>
+      </w:r>
+      <w:r>
+        <w:t xml:space="preserve">82%, Aiken &amp; West, 1991), but its 95% percentile cluster-bootstrap confidence interval (5,000 replications) spans [53%, 253%] (median 80%, IQR [68%, 102%]); the inverted-U shape is recovered in 96.3% of bootstrap replications, but its precise location is only loosely identified. The shaded red vertical band marks the bootstrap CI for the turning point. The estimate should therefore be interpreted as descriptive of the data rather than as structurally identified evidence of an inverted-U.</w:t>
       </w:r>
     </w:p>
     <w:bookmarkEnd w:id="36"/>
@@ -5207,7 +7783,53 @@
         <w:t xml:space="preserve"> </w:t>
       </w:r>
       <w:r>
-        <w:t xml:space="preserve">Cohen’s f² for the TCI direct effect (comparing M2 with M5) is approximately 0.036, in the small-to-medium range; Cohen’s f² for the DAI moderation block (comparing M7 with M8) is approximately 0.018, below Cohen’s (1988) conventional small-effect threshold of 0.02. The exporters-only subsample (N = 84) is underpowered for effects of this magnitude; the consolidated power-bounded inferential reading is established at Section 3.4(ii) and is not repeated here. Taken together, the strongest empirical claim of Section 4 is therefore not that digital adoption yields a large average productivity premium, but that its association with productivity becomes more positive as export intensity rises within the Singapore sample, with the clearest signal concentrated in the high-export tail.</w:t>
+        <w:t xml:space="preserve">Cohen’s</w:t>
+      </w:r>
+      <w:r>
+        <w:t xml:space="preserve"> </w:t>
+      </w:r>
+      <m:oMath>
+        <m:sSup>
+          <m:e>
+            <m:r>
+              <m:t>f</m:t>
+            </m:r>
+          </m:e>
+          <m:sup>
+            <m:r>
+              <m:t>2</m:t>
+            </m:r>
+          </m:sup>
+        </m:sSup>
+      </m:oMath>
+      <w:r>
+        <w:t xml:space="preserve"> </w:t>
+      </w:r>
+      <w:r>
+        <w:t xml:space="preserve">for the TCI direct effect (comparing M2 with M5) is approximately 0.036, in the small-to-medium range; Cohen’s</w:t>
+      </w:r>
+      <w:r>
+        <w:t xml:space="preserve"> </w:t>
+      </w:r>
+      <m:oMath>
+        <m:sSup>
+          <m:e>
+            <m:r>
+              <m:t>f</m:t>
+            </m:r>
+          </m:e>
+          <m:sup>
+            <m:r>
+              <m:t>2</m:t>
+            </m:r>
+          </m:sup>
+        </m:sSup>
+      </m:oMath>
+      <w:r>
+        <w:t xml:space="preserve"> </w:t>
+      </w:r>
+      <w:r>
+        <w:t xml:space="preserve">for the DAI moderation block (comparing M7 with M8) is approximately 0.018, below Cohen’s (1988) conventional small-effect threshold of 0.02. The exporters-only subsample (N = 84) is underpowered for effects of this magnitude; the consolidated power-bounded inferential reading is established at Section 3.4(ii) and is not repeated here. Taken together, the strongest empirical claim of Section 4 is therefore not that digital adoption yields a large average productivity premium, but that its association with productivity becomes more positive as export intensity rises within the Singapore sample, with the clearest signal concentrated in the high-export tail.</w:t>
       </w:r>
     </w:p>
     <w:p>
@@ -5241,7 +7863,15 @@
         <w:t xml:space="preserve"> </w:t>
       </w:r>
       <w:r>
-        <w:t xml:space="preserve">(R5, FSTS &gt; 0; N = 84): the positive quadratic DAI interaction retains its sign (β=+2.821) and the joint F-test is statistically significant (F = 6.32, p = .003), corroborating the amplification mechanism documented in the full sample; the power-bounded inferential reading of this exporters-only result is established at Section 3.4(ii) and is not repeated here. (ii)</w:t>
+        <w:t xml:space="preserve">(R5, FSTS &gt; 0; N = 84): the positive quadratic DAI interaction retains its sign (</w:t>
+      </w:r>
+      <m:oMath>
+        <m:r>
+          <m:t>β</m:t>
+        </m:r>
+      </m:oMath>
+      <w:r>
+        <w:t xml:space="preserve">=+2.821) and the joint F-test is statistically significant (F = 6.32, p = .003), corroborating the amplification mechanism documented in the full sample; the power-bounded inferential reading of this exporters-only result is established at Section 3.4(ii) and is not repeated here. (ii)</w:t>
       </w:r>
       <w:r>
         <w:t xml:space="preserve"> </w:t>
@@ -5254,7 +7884,55 @@
         <w:t xml:space="preserve">Export participation selection</w:t>
       </w:r>
       <w:r>
-        <w:t xml:space="preserve">: the inverse-Mills-ratio sensitivity diagnostic for selection at the extensive margin of exporting is reported at Section 3.4(iv); the diagnostic is consistent with robustness of the H3 amplification mechanism to mild Heckman-style selection adjustment, with the key DAI × FSTS² interaction altered by |Δ| &lt; 0.02. (iii)</w:t>
+        <w:t xml:space="preserve">: the inverse-Mills-ratio sensitivity diagnostic for selection at the extensive margin of exporting is reported at Section 3.4(iv); the diagnostic is consistent with robustness of the H3 amplification mechanism to mild Heckman-style selection adjustment, with the key</w:t>
+      </w:r>
+      <w:r>
+        <w:t xml:space="preserve"> </w:t>
+      </w:r>
+      <m:oMath>
+        <m:r>
+          <m:rPr>
+            <m:nor/>
+            <m:sty m:val="p"/>
+          </m:rPr>
+          <m:t>DAI</m:t>
+        </m:r>
+        <m:r>
+          <m:rPr>
+            <m:sty m:val="p"/>
+          </m:rPr>
+          <m:t>×</m:t>
+        </m:r>
+        <m:sSup>
+          <m:e>
+            <m:r>
+              <m:rPr>
+                <m:nor/>
+                <m:sty m:val="p"/>
+              </m:rPr>
+              <m:t>FSTS</m:t>
+            </m:r>
+          </m:e>
+          <m:sup>
+            <m:r>
+              <m:t>2</m:t>
+            </m:r>
+          </m:sup>
+        </m:sSup>
+      </m:oMath>
+      <w:r>
+        <w:t xml:space="preserve"> </w:t>
+      </w:r>
+      <w:r>
+        <w:t xml:space="preserve">interaction altered by |</w:t>
+      </w:r>
+      <m:oMath>
+        <m:r>
+          <m:t>Δ</m:t>
+        </m:r>
+      </m:oMath>
+      <w:r>
+        <w:t xml:space="preserve">| &lt; 0.02. (iii)</w:t>
       </w:r>
       <w:r>
         <w:t xml:space="preserve"> </w:t>
@@ -5876,7 +8554,10 @@
         <w:t xml:space="preserve"> </w:t>
       </w:r>
       <w:r>
-        <w:t xml:space="preserve">logic, the sunk fixed cost of installing advanced digital interfaces is recovered only at extreme export scale; this is one reason the implied turning point is pushed into the high-FSTS tail (≈82%) rather than the conventional 30–60% range (a support-constrained estimate, not a precise threshold). In this role DAI operates as a</w:t>
+        <w:t xml:space="preserve">logic, the sunk fixed cost of installing advanced digital interfaces is recovered only at extreme export scale; this is one reason the implied turning point is pushed into the high-FSTS tail ($</w:t>
+      </w:r>
+      <w:r>
+        <w:t xml:space="preserve">$82%) rather than the conventional 30–60% range (a support-constrained estimate, not a precise threshold). In this role DAI operates as a</w:t>
       </w:r>
       <w:r>
         <w:t xml:space="preserve"> </w:t>
@@ -5942,7 +8623,86 @@
         <w:t xml:space="preserve"> </w:t>
       </w:r>
       <w:r>
-        <w:t xml:space="preserve">interaction term: the positive coefficient on FSTS² × DAI (β=+3.119, p=.005) implies that DAI’s productivity contribution grows super-linearly with export-intensity scale, which a level-shift substitution mechanism (predicting only a linear FSTS × DAI shift) would not produce. The robustness of this quadratic interaction across sample restrictions (R1 thin-website, R3 excl micro-firms, R4 SMEs only, R5 exporters-only) and across indicator-sensitivity diagnostics is in turn inconsistent with a pure selection story: under selection, the simultaneous productivity–DAI–FSTS correlation should attenuate substantially when the firms driving the joint selection are removed, but the positive quadratic sign is preserved throughout. The selection confound cannot be fully eliminated without stronger causal identification, for which no instrument satisfying the exclusion restriction is available in the single-wave Singapore design, and the Section 4.5 (ii) Heckman sensitivity diagnostic indicates mild but non-eliminating extensive-margin selection. Read together, the evidence supports amplification as the focal mechanism while retaining selection as a bounded residual concern, in line with the Section 2.3.4 pre-commitment to amplification as the focal theoretical expectation.</w:t>
+        <w:t xml:space="preserve">interaction term: the positive coefficient on</w:t>
+      </w:r>
+      <w:r>
+        <w:t xml:space="preserve"> </w:t>
+      </w:r>
+      <m:oMath>
+        <m:sSup>
+          <m:e>
+            <m:r>
+              <m:rPr>
+                <m:nor/>
+                <m:sty m:val="p"/>
+              </m:rPr>
+              <m:t>FSTS</m:t>
+            </m:r>
+          </m:e>
+          <m:sup>
+            <m:r>
+              <m:t>2</m:t>
+            </m:r>
+          </m:sup>
+        </m:sSup>
+        <m:r>
+          <m:rPr>
+            <m:sty m:val="p"/>
+          </m:rPr>
+          <m:t>×</m:t>
+        </m:r>
+        <m:r>
+          <m:rPr>
+            <m:nor/>
+            <m:sty m:val="p"/>
+          </m:rPr>
+          <m:t>DAI</m:t>
+        </m:r>
+      </m:oMath>
+      <w:r>
+        <w:t xml:space="preserve"> </w:t>
+      </w:r>
+      <w:r>
+        <w:t xml:space="preserve">(</w:t>
+      </w:r>
+      <m:oMath>
+        <m:r>
+          <m:t>β</m:t>
+        </m:r>
+      </m:oMath>
+      <w:r>
+        <w:t xml:space="preserve">=+3.119, p=.005) implies that DAI’s productivity contribution grows super-linearly with export-intensity scale, which a level-shift substitution mechanism (predicting only a linear</w:t>
+      </w:r>
+      <w:r>
+        <w:t xml:space="preserve"> </w:t>
+      </w:r>
+      <m:oMath>
+        <m:r>
+          <m:rPr>
+            <m:nor/>
+            <m:sty m:val="p"/>
+          </m:rPr>
+          <m:t>FSTS</m:t>
+        </m:r>
+        <m:r>
+          <m:rPr>
+            <m:sty m:val="p"/>
+          </m:rPr>
+          <m:t>×</m:t>
+        </m:r>
+        <m:r>
+          <m:rPr>
+            <m:nor/>
+            <m:sty m:val="p"/>
+          </m:rPr>
+          <m:t>DAI</m:t>
+        </m:r>
+      </m:oMath>
+      <w:r>
+        <w:t xml:space="preserve"> </w:t>
+      </w:r>
+      <w:r>
+        <w:t xml:space="preserve">shift) would not produce. The robustness of this quadratic interaction across sample restrictions (R1 thin-website, R3 excl micro-firms, R4 SMEs only, R5 exporters-only) and across indicator-sensitivity diagnostics is in turn inconsistent with a pure selection story: under selection, the simultaneous productivity–DAI–FSTS correlation should attenuate substantially when the firms driving the joint selection are removed, but the positive quadratic sign is preserved throughout. The selection confound cannot be fully eliminated without stronger causal identification, for which no instrument satisfying the exclusion restriction is available in the single-wave Singapore design, and the Section 4.5 (ii) Heckman sensitivity diagnostic indicates mild but non-eliminating extensive-margin selection. Read together, the evidence supports amplification as the focal mechanism while retaining selection as a bounded residual concern, in line with the Section 2.3.4 pre-commitment to amplification as the focal theoretical expectation.</w:t>
       </w:r>
     </w:p>
     <w:p>
@@ -5992,7 +8752,18 @@
         <w:t xml:space="preserve"> </w:t>
       </w:r>
       <w:r>
-        <w:t xml:space="preserve">composition of the DAI construct used here. This paper’s DAI combines website presence (Tier-1, c22b) with two-way electronic-payment intensity (Tier-2, k33 customer side and k38 supplier side) into a single composite, and the empirical signal is concentrated in the Tier-2 transaction-enabling layer. The Section 4.5 R1 specification makes this clear: when DAI is reduced to the website-only Tier-1 binary, the quadratic interaction weakens substantially (β drops from +3.119 to +1.552, joint F retained marginal at 4.01, p = .019), and the item-swap falsification test indicates that the moderation weakens substantially when c22b is moved from DAI to TCI. This construct-composition dependence has a broader implication for how digital-adoption evidence should be read across institutional contexts at different positions on the regulatory and infrastructural spectrum: in advanced-economy settings where Tier-2 transaction-enabling infrastructure (electronic-payment rails, two-way digital interfaces with customers and suppliers) is widely diffused alongside Tier-1 digital presence, a Tier-1+2 composite is the construct that retains discriminatory power across the export-intensity range, and the amplification mechanism becomes empirically detectable as the upward rotation of the I–P curve documented in this paper. In emerging-economy settings where Tier-1 digital presence has diffused widely but Tier-2 transaction-enabling infrastructure remains limited or institutionally bounded, a Tier-1-only construct is expected to lose discriminatory power as the population-diffusion ceiling is approached, and any contingent association with export intensity is then most plausibly read as construct-tier obsolescence rather than as evidence on dynamic digital capability. The amplification mechanism documented in Singapore therefore should not be over-extrapolated to settings where the underlying Tier-2 infrastructure has not yet matured to a level that allows the transaction-enabling layer to absorb the coordination-cost saturation of high-intensity exporting; conversely, the Singapore evidence sharpens the theoretical claim that the conditional-scaling mechanism becomes empirically legible precisely when domestic saturation removes the uniform-premium effect and the Tier-2 transaction-enabling layer is institutionally available. This construct-boundary framing positions the Singapore findings as a within-context boundary case at the advanced-economy ceiling of the institutional and digital-infrastructure spectrum, rather than as a claim about a broadly applicable digital-complementarity logic.</w:t>
+        <w:t xml:space="preserve">composition of the DAI construct used here. This paper’s DAI combines website presence (Tier-1, c22b) with two-way electronic-payment intensity (Tier-2, k33 customer side and k38 supplier side) into a single composite, and the empirical signal is concentrated in the Tier-2 transaction-enabling layer. The Section 4.5 R1 specification makes this clear: when DAI is reduced to the website-only Tier-1 binary, the quadratic interaction weakens substantially (</w:t>
+      </w:r>
+      <m:oMath>
+        <m:r>
+          <m:t>β</m:t>
+        </m:r>
+      </m:oMath>
+      <w:r>
+        <w:t xml:space="preserve"> </w:t>
+      </w:r>
+      <w:r>
+        <w:t xml:space="preserve">drops from +3.119 to +1.552, joint F retained marginal at 4.01, p = .019), and the item-swap falsification test indicates that the moderation weakens substantially when c22b is moved from DAI to TCI. This construct-composition dependence has a broader implication for how digital-adoption evidence should be read across institutional contexts at different positions on the regulatory and infrastructural spectrum: in advanced-economy settings where Tier-2 transaction-enabling infrastructure (electronic-payment rails, two-way digital interfaces with customers and suppliers) is widely diffused alongside Tier-1 digital presence, a Tier-1+2 composite is the construct that retains discriminatory power across the export-intensity range, and the amplification mechanism becomes empirically detectable as the upward rotation of the I–P curve documented in this paper. In emerging-economy settings where Tier-1 digital presence has diffused widely but Tier-2 transaction-enabling infrastructure remains limited or institutionally bounded, a Tier-1-only construct is expected to lose discriminatory power as the population-diffusion ceiling is approached, and any contingent association with export intensity is then most plausibly read as construct-tier obsolescence rather than as evidence on dynamic digital capability. The amplification mechanism documented in Singapore therefore should not be over-extrapolated to settings where the underlying Tier-2 infrastructure has not yet matured to a level that allows the transaction-enabling layer to absorb the coordination-cost saturation of high-intensity exporting; conversely, the Singapore evidence sharpens the theoretical claim that the conditional-scaling mechanism becomes empirically legible precisely when domestic saturation removes the uniform-premium effect and the Tier-2 transaction-enabling layer is institutionally available. This construct-boundary framing positions the Singapore findings as a within-context boundary case at the advanced-economy ceiling of the institutional and digital-infrastructure spectrum, rather than as a claim about a broadly applicable digital-complementarity logic.</w:t>
       </w:r>
     </w:p>
     <w:p>

</xml_diff>

<commit_message>
fix(en-papers): resolve audit-flagged academic language and LaTeX issues
P4 Singapore:
- Remove "marginally significant" qualifier (2 occurrences) — replaced with
  exact p-value notation or plain phrasing (Meyer et al. 2017 standard)

P5 China:
- Contraction "don't know" → "do not know" (2 occurrences) per WBES codebook ref
- "marginally significant" removed from F-test sentence; exact p-value retained

P6 Meta:
- Fix unbalanced math spans: $\geq\$85% → $\geq$ 85% (2 occurrences),
  $\approx\$497 → $\approx$ 497 — currency-protection artifact from LaTeX formatter
- Bare κ → $\kappa$ in prose (lines 13, 191); $\kappa \geq 0.70$ (3 occurrences)
- Dollar-sign balance now 182 (even) ✓

Rebuilt: dist/HO_SO_NOP/05_BAI_BAO_EN/p4/p5/p6 DOCXs

https://claude.ai/code/session_01TNqoRFY1vAVQL6GWg8X9M3
</commit_message>
<xml_diff>
--- a/dist/HO_SO_NOP/05_BAI_BAO_EN/p4_singapore_en.docx
+++ b/dist/HO_SO_NOP/05_BAI_BAO_EN/p4_singapore_en.docx
@@ -153,8 +153,16 @@
         <w:t xml:space="preserve"> </w:t>
       </w:r>
       <w:r>
-        <w:t xml:space="preserve">This study makes one primary contribution and two supporting contributions. Its primary contribution is to show that foundational digital adoption (DAI) functions as a conditional scaling resource rather than a uniform productivity premium in a digitally advanced economy: the productivity association of Tier 1–2 digital adoption is weak across most of the export-intensity distribution and becomes more positive only in the high-export tail, where cross-border coordination demands are densest. This within-context evidence from Singapore supports a contingent digital complementarity mechanism, with DAI acting as a scaling lever whose value is realised under export-intensity conditions rather than as a broad firm-level capability advantage. The evidence for this mechanism (H4: positive quadratic DAI×</w:t>
-      </w:r>
+        <w:t xml:space="preserve">This study makes one primary contribution and two supporting contributions. Its primary contribution is to show that foundational digital adoption (DAI) functions as a conditional scaling resource rather than a uniform productivity premium in a digitally advanced economy: the productivity association of Tier 1–2 digital adoption is weak across most of the export-intensity distribution and becomes more positive only in the high-export tail, where cross-border coordination demands are densest. This within-context evidence from Singapore supports a contingent digital complementarity mechanism, with DAI acting as a scaling lever whose value is realised under export-intensity conditions rather than as a broad firm-level capability advantage. The evidence for this mechanism (H4: positive quadratic DAI</w:t>
+      </w:r>
+      <m:oMath>
+        <m:r>
+          <m:rPr>
+            <m:sty m:val="p"/>
+          </m:rPr>
+          <m:t>×</m:t>
+        </m:r>
+      </m:oMath>
       <m:oMath>
         <m:sSup>
           <m:e>
@@ -194,7 +202,18 @@
         <w:t xml:space="preserve"> </w:t>
       </w:r>
       <w:r>
-        <w:t xml:space="preserve">interaction, β=+3.119, p=.005) is the most distinctive empirical finding, and the one least anticipated by prior literature.</w:t>
+        <w:t xml:space="preserve">interaction,</w:t>
+      </w:r>
+      <w:r>
+        <w:t xml:space="preserve"> </w:t>
+      </w:r>
+      <m:oMath>
+        <m:r>
+          <m:t>β</m:t>
+        </m:r>
+      </m:oMath>
+      <w:r>
+        <w:t xml:space="preserve">=+3.119, p=.005) is the most distinctive empirical finding, and the one least anticipated by prior literature.</w:t>
       </w:r>
       <w:r>
         <w:t xml:space="preserve"> </w:t>
@@ -380,7 +399,38 @@
         <w:t xml:space="preserve"> </w:t>
       </w:r>
       <w:r>
-        <w:t xml:space="preserve">Hypothesis 3 (H3). The productivity association of digital adoption (DAI) in Singapore varies systematically across the export-intensity distribution: empirically, the joint test on the DAI direct and DAI×FSTS interaction terms rejects the null of a uniform DAI–productivity association across the full FSTS range.</w:t>
+        <w:t xml:space="preserve">Hypothesis 3 (H3). The productivity association of digital adoption (DAI) in Singapore varies systematically across the export-intensity distribution: empirically, the joint test on the DAI direct and</w:t>
+      </w:r>
+      <w:r>
+        <w:t xml:space="preserve"> </w:t>
+      </w:r>
+      <m:oMath>
+        <m:r>
+          <m:rPr>
+            <m:nor/>
+            <m:sty m:val="p"/>
+          </m:rPr>
+          <m:t>DAI</m:t>
+        </m:r>
+        <m:r>
+          <m:rPr>
+            <m:sty m:val="p"/>
+          </m:rPr>
+          <m:t>×</m:t>
+        </m:r>
+        <m:r>
+          <m:rPr>
+            <m:nor/>
+            <m:sty m:val="p"/>
+          </m:rPr>
+          <m:t>FSTS</m:t>
+        </m:r>
+      </m:oMath>
+      <w:r>
+        <w:t xml:space="preserve"> </w:t>
+      </w:r>
+      <w:r>
+        <w:t xml:space="preserve">interaction terms rejects the null of a uniform DAI–productivity association across the full FSTS range.</w:t>
       </w:r>
       <w:r>
         <w:t xml:space="preserve"> </w:t>
@@ -2207,7 +2257,30 @@
         </m:r>
       </m:oMath>
       <w:r>
-        <w:t xml:space="preserve">. A supplementary specification replaces the DAI interaction block with analogous TCI interaction terms in order to assess whether any TCI moderation is empirically detectable beyond its more stable direct association with productivity. Following the recommendations of Haans et al. (2016) for testing curvilinear relationships in strategy research, the study applies the Lind and Mehlum (2010) test for a U-shaped or inverted-U relationship to assess the quadratic shape formally. To assess whether the DAI interaction block matters jointly, the study reports a joint F-test on the two DAI interaction terms and also interprets effect size using Cohen’s f² (Aguinis et al., 2005; Cohen, 1988). All estimations are performed in Stata 18 with the</w:t>
+        <w:t xml:space="preserve">. A supplementary specification replaces the DAI interaction block with analogous TCI interaction terms in order to assess whether any TCI moderation is empirically detectable beyond its more stable direct association with productivity. Following the recommendations of Haans et al. (2016) for testing curvilinear relationships in strategy research, the study applies the Lind and Mehlum (2010) test for a U-shaped or inverted-U relationship to assess the quadratic shape formally. To assess whether the DAI interaction block matters jointly, the study reports a joint F-test on the two DAI interaction terms and also interprets effect size using Cohen’s</w:t>
+      </w:r>
+      <w:r>
+        <w:t xml:space="preserve"> </w:t>
+      </w:r>
+      <m:oMath>
+        <m:sSup>
+          <m:e>
+            <m:r>
+              <m:t>f</m:t>
+            </m:r>
+          </m:e>
+          <m:sup>
+            <m:r>
+              <m:t>2</m:t>
+            </m:r>
+          </m:sup>
+        </m:sSup>
+      </m:oMath>
+      <w:r>
+        <w:t xml:space="preserve"> </w:t>
+      </w:r>
+      <w:r>
+        <w:t xml:space="preserve">(Aguinis et al., 2005; Cohen, 1988). All estimations are performed in Stata 18 with the</w:t>
       </w:r>
       <w:r>
         <w:t xml:space="preserve"> </w:t>
@@ -2587,7 +2660,7 @@
         <w:t xml:space="preserve"> </w:t>
       </w:r>
       <w:r>
-        <w:t xml:space="preserve">In the baseline quadratic specification (Model M2), the linear FSTS term is positive and statistically significant, whereas the squared term is negative and only marginally significant. The fitted curve therefore implies a turning point in the upper tail of the export-intensity distribution, near FSTS = 82% on the original scale, but that point is imprecisely located and falls in a sparsely populated region of the data. The 5,000-replication bootstrap recovers an inverted-U shape frequently (96.3% of replications), yet the corresponding 95% percentile confidence interval for the turning point is wide ([53%, 253%]), and the Lind–Mehlum test does not formally confirm a conventional inverted-U at conventional significance levels (p = .303). This null is itself an informative positive result: Singapore’s DAI distribution is concentrated at the high end, approximately 67% of firms report website presence and Tier 2 e-payment adoption is widespread, leaving insufficient distributional spread to formally identify the right-side decline within the observable FSTS range. In a digitally mature economy where Tier 1–2 coordination tools are widely diffused, the attenuation of the classic coordination-cost mechanism is consistent with the saturation hypothesis underlying H4 rather than constituting a failure of the inverted-U framework. The most defensible interpretation is therefore not that the inverted-U is firmly established, but that the full-sample relationship is predominantly positive with mild quadratic curvature over the observed export-intensity range. In this sense, the quadratic fit is informative descriptively, while stronger claims about a structurally identified right-side decline remain beyond what the present data can support. Read this way, the evidence qualifies rather than overturns the conventional nonlinear literature, while keeping interpretation within the empirical support actually available in the Singapore sample.</w:t>
+        <w:t xml:space="preserve">In the baseline quadratic specification (Model M2), the linear FSTS term is positive and statistically significant, whereas the squared term is negative (p = .056, approaching conventional significance thresholds). The fitted curve therefore implies a turning point in the upper tail of the export-intensity distribution, near FSTS = 82% on the original scale, but that point is imprecisely located and falls in a sparsely populated region of the data. The 5,000-replication bootstrap recovers an inverted-U shape frequently (96.3% of replications), yet the corresponding 95% percentile confidence interval for the turning point is wide ([53%, 253%]), and the Lind–Mehlum test does not formally confirm a conventional inverted-U at conventional significance levels (p = .303). This null is itself an informative positive result: Singapore’s DAI distribution is concentrated at the high end, approximately 67% of firms report website presence and Tier 2 e-payment adoption is widespread, leaving insufficient distributional spread to formally identify the right-side decline within the observable FSTS range. In a digitally mature economy where Tier 1–2 coordination tools are widely diffused, the attenuation of the classic coordination-cost mechanism is consistent with the saturation hypothesis underlying H4 rather than constituting a failure of the inverted-U framework. The most defensible interpretation is therefore not that the inverted-U is firmly established, but that the full-sample relationship is predominantly positive with mild quadratic curvature over the observed export-intensity range. In this sense, the quadratic fit is informative descriptively, while stronger claims about a structurally identified right-side decline remain beyond what the present data can support. Read this way, the evidence qualifies rather than overturns the conventional nonlinear literature, while keeping interpretation within the empirical support actually available in the Singapore sample.</w:t>
       </w:r>
     </w:p>
     <w:bookmarkEnd w:id="24"/>
@@ -2605,13 +2678,58 @@
         <w:pStyle w:val="FirstParagraph"/>
       </w:pPr>
       <w:r>
-        <w:t xml:space="preserve">The direct-effect model for technological capability (Model M5) shows that TCI is positively associated with labour productivity (β = 0.168, SE = 0.040, p &lt; .001). Model fit also improves relative to the quadratic baseline, with R² rising from 0.178 in Model M2 to 0.199 in Model M5. This pattern supports the view that technological capability raises the firm’s productivity base rather than simply proxying for export intensity.</w:t>
-      </w:r>
-      <w:r>
-        <w:t xml:space="preserve"> </w:t>
-      </w:r>
-      <w:r>
-        <w:t xml:space="preserve">In the supplementary TCI-moderation specification (Model M3), the direct TCI coefficient remains positive and significant (β = 0.188, p &lt; .001), but the interaction terms involving FSTS and squared FSTS are jointly insignificant. Because the absence of moderation cannot be inferred from non-significance alone, the evidence is better read as supporting an intercept-dominant interpretation of the TCI association rather than as a definitive demonstration that curvature moderation is exactly zero. Taken together, the evidence is more consistent with an intercept-dominant reading of the TCI association than with a clearly identified moderation channel in the internationalization–performance relationship. This is also the most coherent reading for hypothesis development, because it preserves the distinction between internal capability depth and export-contingent digital complementarity.</w:t>
+        <w:t xml:space="preserve">The direct-effect model for technological capability (Model M5) shows that TCI is positively associated with labour productivity (</w:t>
+      </w:r>
+      <m:oMath>
+        <m:r>
+          <m:t>β</m:t>
+        </m:r>
+      </m:oMath>
+      <w:r>
+        <w:t xml:space="preserve"> </w:t>
+      </w:r>
+      <w:r>
+        <w:t xml:space="preserve">= 0.168, SE = 0.040, p &lt; .001). Model fit also improves relative to the quadratic baseline, with</w:t>
+      </w:r>
+      <w:r>
+        <w:t xml:space="preserve"> </w:t>
+      </w:r>
+      <m:oMath>
+        <m:sSup>
+          <m:e>
+            <m:r>
+              <m:t>R</m:t>
+            </m:r>
+          </m:e>
+          <m:sup>
+            <m:r>
+              <m:t>2</m:t>
+            </m:r>
+          </m:sup>
+        </m:sSup>
+      </m:oMath>
+      <w:r>
+        <w:t xml:space="preserve"> </w:t>
+      </w:r>
+      <w:r>
+        <w:t xml:space="preserve">rising from 0.178 in Model M2 to 0.199 in Model M5. This pattern supports the view that technological capability raises the firm’s productivity base rather than simply proxying for export intensity.</w:t>
+      </w:r>
+      <w:r>
+        <w:t xml:space="preserve"> </w:t>
+      </w:r>
+      <w:r>
+        <w:t xml:space="preserve">In the supplementary TCI-moderation specification (Model M3), the direct TCI coefficient remains positive and significant (</w:t>
+      </w:r>
+      <m:oMath>
+        <m:r>
+          <m:t>β</m:t>
+        </m:r>
+      </m:oMath>
+      <w:r>
+        <w:t xml:space="preserve"> </w:t>
+      </w:r>
+      <w:r>
+        <w:t xml:space="preserve">= 0.188, p &lt; .001), but the interaction terms involving FSTS and squared FSTS are jointly insignificant. Because the absence of moderation cannot be inferred from non-significance alone, the evidence is better read as supporting an intercept-dominant interpretation of the TCI association rather than as a definitive demonstration that curvature moderation is exactly zero. Taken together, the evidence is more consistent with an intercept-dominant reading of the TCI association than with a clearly identified moderation channel in the internationalization–performance relationship. This is also the most coherent reading for hypothesis development, because it preserves the distinction between internal capability depth and export-contingent digital complementarity.</w:t>
       </w:r>
       <w:r>
         <w:t xml:space="preserve"> </w:t>
@@ -2623,7 +2741,32 @@
         <w:t xml:space="preserve"> </w:t>
       </w:r>
       <w:r>
-        <w:t xml:space="preserve">In the direct-effect model for digital adoption (Model M6), DAI is positively associated with labour productivity (β = 0.104, SE = 0.038, p = .007). However, once TCI is included alongside DAI in Model M7, the DAI coefficient attenuates to β = 0.077 and remains marginal (p = .048), indicating partial overlap in the average-firm heterogeneity captured by the two constructs. This attenuation is substantively important because it suggests that DAI should not be interpreted as a large, universal productivity premium across all firms.</w:t>
+        <w:t xml:space="preserve">In the direct-effect model for digital adoption (Model M6), DAI is positively associated with labour productivity (</w:t>
+      </w:r>
+      <m:oMath>
+        <m:r>
+          <m:t>β</m:t>
+        </m:r>
+      </m:oMath>
+      <w:r>
+        <w:t xml:space="preserve"> </w:t>
+      </w:r>
+      <w:r>
+        <w:t xml:space="preserve">= 0.104, SE = 0.038, p = .007). However, once TCI is included alongside DAI in Model M7, the DAI coefficient attenuates to</w:t>
+      </w:r>
+      <w:r>
+        <w:t xml:space="preserve"> </w:t>
+      </w:r>
+      <m:oMath>
+        <m:r>
+          <m:t>β</m:t>
+        </m:r>
+      </m:oMath>
+      <w:r>
+        <w:t xml:space="preserve"> </w:t>
+      </w:r>
+      <w:r>
+        <w:t xml:space="preserve">= 0.077 and remains marginal (p = .048), indicating partial overlap in the average-firm heterogeneity captured by the two constructs. This attenuation is substantively important because it suggests that DAI should not be interpreted as a large, universal productivity premium across all firms.</w:t>
       </w:r>
       <w:r>
         <w:t xml:space="preserve"> </w:t>
@@ -3682,8 +3825,19 @@
             <w:r>
               <w:t xml:space="preserve"> </w:t>
             </w:r>
-            <w:r>
-              <w:t xml:space="preserve">× DAI</w:t>
+            <m:oMath>
+              <m:r>
+                <m:rPr>
+                  <m:sty m:val="p"/>
+                </m:rPr>
+                <m:t>×</m:t>
+              </m:r>
+            </m:oMath>
+            <w:r>
+              <w:t xml:space="preserve"> </w:t>
+            </w:r>
+            <w:r>
+              <w:t xml:space="preserve">DAI</w:t>
             </w:r>
           </w:p>
         </w:tc>
@@ -4628,7 +4782,86 @@
         <w:t xml:space="preserve"> </w:t>
       </w:r>
       <w:r>
-        <w:t xml:space="preserve">The strongest evidence for DAI appears in the moderation specifications. In the full model (Model M8), the direct DAI term is small and not statistically significant (β = 0.019, p = .705), the linear interaction with FSTS is negative and marginal (β = −1.177, p = .083), and the quadratic interaction term is positive and statistically significant (β = 3.119, SE = 1.124, p = .005). Model M8 also produces the highest explanatory power among the main specifications, with R² = 0.211 and adjusted R² = 0.196. Read substantively, these estimates indicate that the productivity relevance of digital adoption becomes more positive at higher levels of export intensity, with the clearest signal concentrated in the high-export tail rather than distributed uniformly across the sample.</w:t>
+        <w:t xml:space="preserve">The strongest evidence for DAI appears in the moderation specifications. In the full model (Model M8), the direct DAI term is small and not statistically significant (</w:t>
+      </w:r>
+      <m:oMath>
+        <m:r>
+          <m:t>β</m:t>
+        </m:r>
+      </m:oMath>
+      <w:r>
+        <w:t xml:space="preserve"> </w:t>
+      </w:r>
+      <w:r>
+        <w:t xml:space="preserve">= 0.019, p = .705), the linear interaction with FSTS is negative and marginal (</w:t>
+      </w:r>
+      <m:oMath>
+        <m:r>
+          <m:t>β</m:t>
+        </m:r>
+      </m:oMath>
+      <w:r>
+        <w:t xml:space="preserve"> </w:t>
+      </w:r>
+      <w:r>
+        <w:t xml:space="preserve">= −1.177, p = .083), and the quadratic interaction term is positive and statistically significant (</w:t>
+      </w:r>
+      <m:oMath>
+        <m:r>
+          <m:t>β</m:t>
+        </m:r>
+      </m:oMath>
+      <w:r>
+        <w:t xml:space="preserve"> </w:t>
+      </w:r>
+      <w:r>
+        <w:t xml:space="preserve">= 3.119, SE = 1.124, p = .005). Model M8 also produces the highest explanatory power among the main specifications, with</w:t>
+      </w:r>
+      <w:r>
+        <w:t xml:space="preserve"> </w:t>
+      </w:r>
+      <m:oMath>
+        <m:sSup>
+          <m:e>
+            <m:r>
+              <m:t>R</m:t>
+            </m:r>
+          </m:e>
+          <m:sup>
+            <m:r>
+              <m:t>2</m:t>
+            </m:r>
+          </m:sup>
+        </m:sSup>
+      </m:oMath>
+      <w:r>
+        <w:t xml:space="preserve"> </w:t>
+      </w:r>
+      <w:r>
+        <w:t xml:space="preserve">= 0.211 and adjusted</w:t>
+      </w:r>
+      <w:r>
+        <w:t xml:space="preserve"> </w:t>
+      </w:r>
+      <m:oMath>
+        <m:sSup>
+          <m:e>
+            <m:r>
+              <m:t>R</m:t>
+            </m:r>
+          </m:e>
+          <m:sup>
+            <m:r>
+              <m:t>2</m:t>
+            </m:r>
+          </m:sup>
+        </m:sSup>
+      </m:oMath>
+      <w:r>
+        <w:t xml:space="preserve"> </w:t>
+      </w:r>
+      <w:r>
+        <w:t xml:space="preserve">= 0.196. Read substantively, these estimates indicate that the productivity relevance of digital adoption becomes more positive at higher levels of export intensity, with the clearest signal concentrated in the high-export tail rather than distributed uniformly across the sample.</w:t>
       </w:r>
       <w:r>
         <w:t xml:space="preserve"> </w:t>
@@ -5292,7 +5525,7 @@
         <w:t xml:space="preserve"> </w:t>
       </w:r>
       <w:r>
-        <w:t xml:space="preserve">Table 3 and Figure 2 translate the interaction estimates from Model M8 into substantively interpretable marginal effects across the export-intensity distribution. At FSTS = 0, the marginal effect of DAI is small but positive and marginally significant (+0.080, p = .045), indicating only a modest baseline association among purely domestic firms. Across the low-export and middle export range, however, the marginal effect is statistically indistinguishable from zero, which indicates that basic digital adoption does not generate a large universal labour-productivity premium across the full sample. By contrast, the marginal effect becomes positive and statistically significant among high-intensity exporters, reaching +0.660 at FSTS = 70% and +1.818 at FSTS = 100% (Table 3). This pattern supports the interpretation of DAI as a scale-enabling complement whose productivity relevance emerges more clearly when firms face denser cross-border coordination and transaction demands.</w:t>
+        <w:t xml:space="preserve">Table 3 and Figure 2 translate the interaction estimates from Model M8 into substantively interpretable marginal effects across the export-intensity distribution. At FSTS = 0, the marginal effect of DAI is small but positive (+0.080, p = .045), indicating only a modest baseline association among purely domestic firms. Across the low-export and middle export range, however, the marginal effect is statistically indistinguishable from zero, which indicates that basic digital adoption does not generate a large universal labour-productivity premium across the full sample. By contrast, the marginal effect becomes positive and statistically significant among high-intensity exporters, reaching +0.660 at FSTS = 70% and +1.818 at FSTS = 100% (Table 3). This pattern supports the interpretation of DAI as a scale-enabling complement whose productivity relevance emerges more clearly when firms face denser cross-border coordination and transaction demands.</w:t>
       </w:r>
       <w:r>
         <w:t xml:space="preserve"> </w:t>
@@ -5424,7 +5657,78 @@
         <w:t xml:space="preserve"> </w:t>
       </w:r>
       <w:r>
-        <w:t xml:space="preserve">Predicted internationalization–performance curve. Predicted relationship between export intensity and labour productivity with 95% confidence bands from the canonical quadratic specification (M2). The implied turning point occurs near FSTS = 82% on the original scale (−β₁/2β₂ on mean-centered FSTS ≈ 77.8%; adding back the sample mean of 0.045 gives ≈ 82%. Aiken &amp; West, 1991), but its 95% percentile cluster-bootstrap confidence interval (5,000 replications) spans [53%, 253%] (median 80%, IQR [68%, 102%]); the inverted-U shape is recovered in 96.3% of bootstrap replications, but its precise location is only loosely identified. The shaded red vertical band marks the bootstrap CI for the turning point. The estimate should therefore be interpreted as descriptive of the data rather than as structurally identified evidence of an inverted-U.</w:t>
+        <w:t xml:space="preserve">Predicted internationalization–performance curve. Predicted relationship between export intensity and labour productivity with 95% confidence bands from the canonical quadratic specification (M2). The implied turning point occurs near FSTS = 82% on the original scale (−</w:t>
+      </w:r>
+      <m:oMath>
+        <m:sSub>
+          <m:e>
+            <m:r>
+              <m:t>β</m:t>
+            </m:r>
+          </m:e>
+          <m:sub>
+            <m:r>
+              <m:t>1</m:t>
+            </m:r>
+          </m:sub>
+        </m:sSub>
+      </m:oMath>
+      <w:r>
+        <w:t xml:space="preserve">/2</w:t>
+      </w:r>
+      <m:oMath>
+        <m:sSub>
+          <m:e>
+            <m:r>
+              <m:t>β</m:t>
+            </m:r>
+          </m:e>
+          <m:sub>
+            <m:r>
+              <m:t>2</m:t>
+            </m:r>
+          </m:sub>
+        </m:sSub>
+      </m:oMath>
+      <w:r>
+        <w:t xml:space="preserve"> </w:t>
+      </w:r>
+      <w:r>
+        <w:t xml:space="preserve">on mean-centered FSTS</w:t>
+      </w:r>
+      <w:r>
+        <w:t xml:space="preserve"> </w:t>
+      </w:r>
+      <m:oMath>
+        <m:r>
+          <m:rPr>
+            <m:sty m:val="p"/>
+          </m:rPr>
+          <m:t>≈</m:t>
+        </m:r>
+      </m:oMath>
+      <w:r>
+        <w:t xml:space="preserve"> </w:t>
+      </w:r>
+      <w:r>
+        <w:t xml:space="preserve">77.8%; adding back the sample mean of 0.045 gives</w:t>
+      </w:r>
+      <w:r>
+        <w:t xml:space="preserve"> </w:t>
+      </w:r>
+      <m:oMath>
+        <m:r>
+          <m:rPr>
+            <m:sty m:val="p"/>
+          </m:rPr>
+          <m:t>≈</m:t>
+        </m:r>
+      </m:oMath>
+      <w:r>
+        <w:t xml:space="preserve"> </w:t>
+      </w:r>
+      <w:r>
+        <w:t xml:space="preserve">82%. Aiken &amp; West, 1991), but its 95% percentile cluster-bootstrap confidence interval (5,000 replications) spans [53%, 253%] (median 80%, IQR [68%, 102%]); the inverted-U shape is recovered in 96.3% of bootstrap replications, but its precise location is only loosely identified. The shaded red vertical band marks the bootstrap CI for the turning point. The estimate should therefore be interpreted as descriptive of the data rather than as structurally identified evidence of an inverted-U.</w:t>
       </w:r>
       <w:r>
         <w:t xml:space="preserve"> </w:t>
@@ -5504,7 +5808,24 @@
         <w:t xml:space="preserve"> </w:t>
       </w:r>
       <w:r>
-        <w:t xml:space="preserve">on mean-centred FSTS ≈ 77.8 %, plus the sample mean 0.045), but the point estimate is loosely identified, its 95 % percentile bootstrap confidence interval spans [53 %, 253 %], and lies in a sparsely populated upper tail of the sample. The Lind–Mehlum test does not formally confirm a conventional inverted-U at standard significance levels. The appropriate interpretation is therefore not that the classic nonlinear literature is overturned, but that in this Singapore sample the right-side decline of the curve appears attenuated or shifted beyond the export range occupied by most firms in the data.</w:t>
+        <w:t xml:space="preserve">on mean-centred FSTS</w:t>
+      </w:r>
+      <w:r>
+        <w:t xml:space="preserve"> </w:t>
+      </w:r>
+      <m:oMath>
+        <m:r>
+          <m:rPr>
+            <m:sty m:val="p"/>
+          </m:rPr>
+          <m:t>≈</m:t>
+        </m:r>
+      </m:oMath>
+      <w:r>
+        <w:t xml:space="preserve"> </w:t>
+      </w:r>
+      <w:r>
+        <w:t xml:space="preserve">77.8 %, plus the sample mean 0.045), but the point estimate is loosely identified, its 95 % percentile bootstrap confidence interval spans [53 %, 253 %], and lies in a sparsely populated upper tail of the sample. The Lind–Mehlum test does not formally confirm a conventional inverted-U at standard significance levels. The appropriate interpretation is therefore not that the classic nonlinear literature is overturned, but that in this Singapore sample the right-side decline of the curve appears attenuated or shifted beyond the export range occupied by most firms in the data.</w:t>
       </w:r>
       <w:r>
         <w:t xml:space="preserve"> </w:t>
@@ -5528,7 +5849,115 @@
         <w:t xml:space="preserve"> </w:t>
       </w:r>
       <w:r>
-        <w:t xml:space="preserve">Cohen’s f² for the TCI direct effect (comparing M2 with M5) is approximately 0.036, in the small-to-medium range; Cohen’s f² for the DAI moderation block (comparing M7 with M8) is approximately 0.018, below Cohen’s (1988) conventional small-effect threshold of 0.02. These effect sizes reinforce a cautious interpretation. A formal power analysis underscores the implication: at f²=0.018 with α=.05 and one numerator degree of freedom, achieving 80% power requires approximately N &gt; 430 (computed from standard power-analysis formulae for multiple regression; cf. Cohen, 1988, pp. 407–414). The full analytic sample (N=617) is adequate for this level, but the exporters-only subsample (N=84) is substantially underpowered for effects of this magnitude, power at N=84 and f²=0.018 is approximately 16%. This means that null DAI moderation results in the exporters-only specification should not be interpreted as evidence against the conditional-scaling mechanism, but as a reflection of inadequate sample size for detecting the small effect implied by the full-sample estimates. The significant exporters-only result reported in the robustness checks (Section 4.5 R5: β=+2.821, joint F p=.003) is therefore a stronger positive signal than its marginal sample size would ordinarily support, and should be interpreted cautiously despite its statistical significance. Taken together, the strongest empirical claim of Section 4 is therefore not that digital adoption yields a large average productivity premium, but that its association with productivity becomes more positive as export intensity rises within the Singapore sample, with the clearest signal concentrated in the high-export tail.</w:t>
+        <w:t xml:space="preserve">Cohen’s</w:t>
+      </w:r>
+      <w:r>
+        <w:t xml:space="preserve"> </w:t>
+      </w:r>
+      <m:oMath>
+        <m:sSup>
+          <m:e>
+            <m:r>
+              <m:t>f</m:t>
+            </m:r>
+          </m:e>
+          <m:sup>
+            <m:r>
+              <m:t>2</m:t>
+            </m:r>
+          </m:sup>
+        </m:sSup>
+      </m:oMath>
+      <w:r>
+        <w:t xml:space="preserve"> </w:t>
+      </w:r>
+      <w:r>
+        <w:t xml:space="preserve">for the TCI direct effect (comparing M2 with M5) is approximately 0.036, in the small-to-medium range; Cohen’s</w:t>
+      </w:r>
+      <w:r>
+        <w:t xml:space="preserve"> </w:t>
+      </w:r>
+      <m:oMath>
+        <m:sSup>
+          <m:e>
+            <m:r>
+              <m:t>f</m:t>
+            </m:r>
+          </m:e>
+          <m:sup>
+            <m:r>
+              <m:t>2</m:t>
+            </m:r>
+          </m:sup>
+        </m:sSup>
+      </m:oMath>
+      <w:r>
+        <w:t xml:space="preserve"> </w:t>
+      </w:r>
+      <w:r>
+        <w:t xml:space="preserve">for the DAI moderation block (comparing M7 with M8) is approximately 0.018, below Cohen’s (1988) conventional small-effect threshold of 0.02. These effect sizes reinforce a cautious interpretation. A formal power analysis underscores the implication: at</w:t>
+      </w:r>
+      <w:r>
+        <w:t xml:space="preserve"> </w:t>
+      </w:r>
+      <m:oMath>
+        <m:sSup>
+          <m:e>
+            <m:r>
+              <m:t>f</m:t>
+            </m:r>
+          </m:e>
+          <m:sup>
+            <m:r>
+              <m:t>2</m:t>
+            </m:r>
+          </m:sup>
+        </m:sSup>
+      </m:oMath>
+      <w:r>
+        <w:t xml:space="preserve">=0.018 with</w:t>
+      </w:r>
+      <w:r>
+        <w:t xml:space="preserve"> </w:t>
+      </w:r>
+      <m:oMath>
+        <m:r>
+          <m:t>α</m:t>
+        </m:r>
+      </m:oMath>
+      <w:r>
+        <w:t xml:space="preserve">=.05 and one numerator degree of freedom, achieving 80% power requires approximately N &gt; 430 (computed from standard power-analysis formulae for multiple regression; cf. Cohen, 1988, pp. 407–414). The full analytic sample (N=617) is adequate for this level, but the exporters-only subsample (N=84) is substantially underpowered for effects of this magnitude, power at N=84 and</w:t>
+      </w:r>
+      <w:r>
+        <w:t xml:space="preserve"> </w:t>
+      </w:r>
+      <m:oMath>
+        <m:sSup>
+          <m:e>
+            <m:r>
+              <m:t>f</m:t>
+            </m:r>
+          </m:e>
+          <m:sup>
+            <m:r>
+              <m:t>2</m:t>
+            </m:r>
+          </m:sup>
+        </m:sSup>
+      </m:oMath>
+      <w:r>
+        <w:t xml:space="preserve">=0.018 is approximately 16%. This means that null DAI moderation results in the exporters-only specification should not be interpreted as evidence against the conditional-scaling mechanism, but as a reflection of inadequate sample size for detecting the small effect implied by the full-sample estimates. The significant exporters-only result reported in the robustness checks (Section 4.5 R5:</w:t>
+      </w:r>
+      <w:r>
+        <w:t xml:space="preserve"> </w:t>
+      </w:r>
+      <m:oMath>
+        <m:r>
+          <m:t>β</m:t>
+        </m:r>
+      </m:oMath>
+      <w:r>
+        <w:t xml:space="preserve">=+2.821, joint F p=.003) is therefore a stronger positive signal than its marginal sample size would ordinarily support, and should be interpreted cautiously despite its statistical significance. Taken together, the strongest empirical claim of Section 4 is therefore not that digital adoption yields a large average productivity premium, but that its association with productivity becomes more positive as export intensity rises within the Singapore sample, with the clearest signal concentrated in the high-export tail.</w:t>
       </w:r>
     </w:p>
     <w:p>
@@ -5562,7 +5991,15 @@
         <w:t xml:space="preserve"> </w:t>
       </w:r>
       <w:r>
-        <w:t xml:space="preserve">(R5, FSTS &gt; 0; N = 84): the positive quadratic DAI interaction retains its sign (β=+2.821) and the joint F-test is significant (F=6.32, p=.003), though individual coefficient precision is reduced by the small exporter sample. This supports the conditional scaling interpretation but should be read cautiously given thin support in the upper tail. (ii)</w:t>
+        <w:t xml:space="preserve">(R5, FSTS &gt; 0; N = 84): the positive quadratic DAI interaction retains its sign (</w:t>
+      </w:r>
+      <m:oMath>
+        <m:r>
+          <m:t>β</m:t>
+        </m:r>
+      </m:oMath>
+      <w:r>
+        <w:t xml:space="preserve">=+2.821) and the joint F-test is significant (F=6.32, p=.003), though individual coefficient precision is reduced by the small exporter sample. This supports the conditional scaling interpretation but should be read cautiously given thin support in the upper tail. (ii)</w:t>
       </w:r>
       <w:r>
         <w:t xml:space="preserve"> </w:t>
@@ -5575,8 +6012,27 @@
         <w:t xml:space="preserve">Export participation selection</w:t>
       </w:r>
       <w:r>
-        <w:t xml:space="preserve">: a Heckman two-step correction was explored, but no instrument satisfying the exclusion restriction for export participation could be identified in the single-wave Singapore design, cross-sectional variation in trade costs or export-promotion eligibility is not available in WBES 2023 Singapore. As a reduced-form sensitivity check, we estimated a first-stage probit of export participation on observable firm characteristics (age, log size, sector fixed effects, and WBES sampling stratum) and added the resulting inverse Mills ratio (IMR) as a covariate in the M8 specification. The IMR enters with marginal significance (β = 0.264, SE = 0.138, t = 1.92, p = .055), indicating mild selection at the extensive margin of export participation. The key DAI×</w:t>
-      </w:r>
+        <w:t xml:space="preserve">: a Heckman two-step correction was explored, but no instrument satisfying the exclusion restriction for export participation could be identified in the single-wave Singapore design, cross-sectional variation in trade costs or export-promotion eligibility is not available in WBES 2023 Singapore. As a reduced-form sensitivity check, we estimated a first-stage probit of export participation on observable firm characteristics (age, log size, sector fixed effects, and WBES sampling stratum) and added the resulting inverse Mills ratio (IMR) as a covariate in the M8 specification. The IMR enters with marginal significance (</w:t>
+      </w:r>
+      <m:oMath>
+        <m:r>
+          <m:t>β</m:t>
+        </m:r>
+      </m:oMath>
+      <w:r>
+        <w:t xml:space="preserve"> </w:t>
+      </w:r>
+      <w:r>
+        <w:t xml:space="preserve">= 0.264, SE = 0.138, t = 1.92, p = .055), indicating mild selection at the extensive margin of export participation. The key DAI</w:t>
+      </w:r>
+      <m:oMath>
+        <m:r>
+          <m:rPr>
+            <m:sty m:val="p"/>
+          </m:rPr>
+          <m:t>×</m:t>
+        </m:r>
+      </m:oMath>
       <m:oMath>
         <m:sSup>
           <m:e>
@@ -5616,7 +6072,15 @@
         <w:t xml:space="preserve"> </w:t>
       </w:r>
       <w:r>
-        <w:t xml:space="preserve">interaction (H4) and the TCI coefficient are not materially altered (|Δ| &lt; 0.02 in each case), confirming that the digital complementarity mechanism is robust to this selection correction. The baseline FSTS and</w:t>
+        <w:t xml:space="preserve">interaction (H4) and the TCI coefficient are not materially altered (|</w:t>
+      </w:r>
+      <m:oMath>
+        <m:r>
+          <m:t>Δ</m:t>
+        </m:r>
+      </m:oMath>
+      <w:r>
+        <w:t xml:space="preserve">| &lt; 0.02 in each case), confirming that the digital complementarity mechanism is robust to this selection correction. The baseline FSTS and</w:t>
       </w:r>
       <w:r>
         <w:t xml:space="preserve"> </w:t>
@@ -5788,8 +6252,19 @@
             <w:r>
               <w:t xml:space="preserve"> </w:t>
             </w:r>
-            <w:r>
-              <w:t xml:space="preserve">× DAI</w:t>
+            <m:oMath>
+              <m:r>
+                <m:rPr>
+                  <m:sty m:val="p"/>
+                </m:rPr>
+                <m:t>×</m:t>
+              </m:r>
+            </m:oMath>
+            <w:r>
+              <w:t xml:space="preserve"> </w:t>
+            </w:r>
+            <w:r>
+              <w:t xml:space="preserve">DAI</w:t>
             </w:r>
           </w:p>
         </w:tc>
@@ -5813,8 +6288,25 @@
               <w:jc w:val="left"/>
             </w:pPr>
             <w:r>
-              <w:t xml:space="preserve">Adj. R²</w:t>
-            </w:r>
+              <w:t xml:space="preserve">Adj.</w:t>
+            </w:r>
+            <w:r>
+              <w:t xml:space="preserve"> </w:t>
+            </w:r>
+            <m:oMath>
+              <m:sSup>
+                <m:e>
+                  <m:r>
+                    <m:t>R</m:t>
+                  </m:r>
+                </m:e>
+                <m:sup>
+                  <m:r>
+                    <m:t>2</m:t>
+                  </m:r>
+                </m:sup>
+              </m:sSup>
+            </m:oMath>
           </w:p>
         </w:tc>
       </w:tr>
@@ -6514,7 +7006,10 @@
         <w:t xml:space="preserve"> </w:t>
       </w:r>
       <w:r>
-        <w:t xml:space="preserve">logic, the sunk fixed cost of installing advanced digital interfaces is recovered only at extreme export scale; this is one reason the implied turning point is pushed into the high-FSTS tail (≈82%) rather than the conventional 30–60% range (a support-constrained estimate, not a precise threshold). In this role DAI operates as a</w:t>
+        <w:t xml:space="preserve">logic, the sunk fixed cost of installing advanced digital interfaces is recovered only at extreme export scale; this is one reason the implied turning point is pushed into the high-FSTS tail ($</w:t>
+      </w:r>
+      <w:r>
+        <w:t xml:space="preserve">$82%) rather than the conventional 30–60% range (a support-constrained estimate, not a precise threshold). In this role DAI operates as a</w:t>
       </w:r>
       <w:r>
         <w:t xml:space="preserve"> </w:t>
@@ -6570,7 +7065,15 @@
         <w:t xml:space="preserve"> </w:t>
       </w:r>
       <w:r>
-        <w:t xml:space="preserve">mechanism, by contrast, would predict that digital adoption raises the marginal productivity return to each unit of export intensity, effectively rotating the I–P curve upward for high-DAI firms rather than merely shifting it. The positive quadratic interaction (β=+3.119, p=.005) fits amplification most closely: DAI specifically elevates productivity in the high-export tail where cross-border coordination demands are densest, and the positive quadratic form implies that DAI’s productivity contribution accelerates rather than merely shifts with export intensity. The remaining candidate, a</w:t>
+        <w:t xml:space="preserve">mechanism, by contrast, would predict that digital adoption raises the marginal productivity return to each unit of export intensity, effectively rotating the I–P curve upward for high-DAI firms rather than merely shifting it. The positive quadratic interaction (</w:t>
+      </w:r>
+      <m:oMath>
+        <m:r>
+          <m:t>β</m:t>
+        </m:r>
+      </m:oMath>
+      <w:r>
+        <w:t xml:space="preserve">=+3.119, p=.005) fits amplification most closely: DAI specifically elevates productivity in the high-export tail where cross-border coordination demands are densest, and the positive quadratic form implies that DAI’s productivity contribution accelerates rather than merely shifts with export intensity. The remaining candidate, a</w:t>
       </w:r>
       <w:r>
         <w:t xml:space="preserve"> </w:t>
@@ -6620,7 +7123,18 @@
         <w:t xml:space="preserve"> </w:t>
       </w:r>
       <w:r>
-        <w:t xml:space="preserve">The DAI construct in this paper (Tier 1+2: website presence c22b + electronic payment intensity k33/k38) is comparatively comprehensive: it combines a Tier 1 digital-presence binary with Tier 2 transaction-enabling indicators. In contexts where only the Tier 1 binary is available, the contingent digital-complementarity mechanism would be expected to be harder to detect because Tier 1 indicators saturate faster than Tier 2 transaction-volume indicators. The positive quadratic interaction documented here (β = +3.119, p = .005) reflects the discriminatory power that Tier 2 e-payment intensity contributes to the composite. The present findings document the Advanced end of the institutional spectrum, where this conditional digital-complementarity mechanism is most legible because domestic Tier 1 saturation removes a confounding uniform-premium effect. More pointedly, the amplification visible in Singapore appears to require a</w:t>
+        <w:t xml:space="preserve">The DAI construct in this paper (Tier 1+2: website presence c22b + electronic payment intensity k33/k38) is comparatively comprehensive: it combines a Tier 1 digital-presence binary with Tier 2 transaction-enabling indicators. In contexts where only the Tier 1 binary is available, the contingent digital-complementarity mechanism would be expected to be harder to detect because Tier 1 indicators saturate faster than Tier 2 transaction-volume indicators. The positive quadratic interaction documented here (</w:t>
+      </w:r>
+      <m:oMath>
+        <m:r>
+          <m:t>β</m:t>
+        </m:r>
+      </m:oMath>
+      <w:r>
+        <w:t xml:space="preserve"> </w:t>
+      </w:r>
+      <w:r>
+        <w:t xml:space="preserve">= +3.119, p = .005) reflects the discriminatory power that Tier 2 e-payment intensity contributes to the composite. The present findings document the Advanced end of the institutional spectrum, where this conditional digital-complementarity mechanism is most legible because domestic Tier 1 saturation removes a confounding uniform-premium effect. More pointedly, the amplification visible in Singapore appears to require a</w:t>
       </w:r>
       <w:r>
         <w:t xml:space="preserve"> </w:t>

</xml_diff>